<commit_message>
made changes in work experience part
</commit_message>
<xml_diff>
--- a/public/resume/resume-mark-anthony-vivar.docx
+++ b/public/resume/resume-mark-anthony-vivar.docx
@@ -1271,7 +1271,7 @@
         <w:spacing w:after="0"/>
       </w:pPr>
       <w:r>
-        <w:t>06/2025 – Current</w:t>
+        <w:t>06/2025 – 04/2026</w:t>
       </w:r>
       <w:r>
         <w:tab/>
@@ -1529,20 +1529,143 @@
     </w:p>
     <w:p>
       <w:pPr>
+        <w:pStyle w:val="ListParagraph"/>
+        <w:numPr>
+          <w:ilvl w:val="0"/>
+          <w:numId w:val="3"/>
+        </w:numPr>
         <w:tabs>
           <w:tab w:val="left" w:pos="2835"/>
           <w:tab w:val="left" w:pos="3261"/>
         </w:tabs>
         <w:spacing w:after="0"/>
       </w:pPr>
-    </w:p>
-    <w:p>
-      <w:pPr>
+      <w:r>
+        <w:t xml:space="preserve">Developed an AI-powered analytics </w:t>
+      </w:r>
+      <w:proofErr w:type="spellStart"/>
+      <w:r>
+        <w:t>chatbot</w:t>
+      </w:r>
+      <w:proofErr w:type="spellEnd"/>
+      <w:r>
+        <w:t xml:space="preserve"> using </w:t>
+      </w:r>
+      <w:proofErr w:type="spellStart"/>
+      <w:r>
+        <w:rPr>
+          <w:rStyle w:val="Strong"/>
+          <w:b w:val="0"/>
+        </w:rPr>
+        <w:t>OpenAI</w:t>
+      </w:r>
+      <w:proofErr w:type="spellEnd"/>
+      <w:r>
+        <w:rPr>
+          <w:rStyle w:val="Strong"/>
+          <w:b w:val="0"/>
+        </w:rPr>
+        <w:t xml:space="preserve">, </w:t>
+      </w:r>
+      <w:proofErr w:type="spellStart"/>
+      <w:r>
+        <w:rPr>
+          <w:rStyle w:val="Strong"/>
+          <w:b w:val="0"/>
+        </w:rPr>
+        <w:t>LangChain</w:t>
+      </w:r>
+      <w:proofErr w:type="spellEnd"/>
+      <w:r>
+        <w:rPr>
+          <w:rStyle w:val="Strong"/>
+          <w:b w:val="0"/>
+        </w:rPr>
+        <w:t>, and Snowflake</w:t>
+      </w:r>
+      <w:r>
+        <w:t xml:space="preserve"> to translate user queries into SQL and generate insights</w:t>
+      </w:r>
+    </w:p>
+    <w:p>
+      <w:pPr>
+        <w:pStyle w:val="ListParagraph"/>
+        <w:numPr>
+          <w:ilvl w:val="0"/>
+          <w:numId w:val="3"/>
+        </w:numPr>
         <w:tabs>
           <w:tab w:val="left" w:pos="2835"/>
           <w:tab w:val="left" w:pos="3261"/>
         </w:tabs>
         <w:spacing w:after="0"/>
+      </w:pPr>
+      <w:r>
+        <w:t xml:space="preserve">Built a </w:t>
+      </w:r>
+      <w:proofErr w:type="spellStart"/>
+      <w:r>
+        <w:rPr>
+          <w:rStyle w:val="Strong"/>
+          <w:b w:val="0"/>
+        </w:rPr>
+        <w:t>serverless</w:t>
+      </w:r>
+      <w:proofErr w:type="spellEnd"/>
+      <w:r>
+        <w:rPr>
+          <w:rStyle w:val="Strong"/>
+          <w:b w:val="0"/>
+        </w:rPr>
+        <w:t xml:space="preserve"> backend (AWS Lambda, Python)</w:t>
+      </w:r>
+      <w:r>
+        <w:t xml:space="preserve"> integrated with a React dashboard for real-time data analytics</w:t>
+      </w:r>
+    </w:p>
+    <w:p>
+      <w:pPr>
+        <w:pStyle w:val="ListParagraph"/>
+        <w:numPr>
+          <w:ilvl w:val="0"/>
+          <w:numId w:val="3"/>
+        </w:numPr>
+        <w:tabs>
+          <w:tab w:val="left" w:pos="2835"/>
+          <w:tab w:val="left" w:pos="3261"/>
+        </w:tabs>
+        <w:spacing w:after="0"/>
+      </w:pPr>
+      <w:r>
+        <w:t xml:space="preserve">Implemented </w:t>
+      </w:r>
+      <w:r>
+        <w:rPr>
+          <w:rStyle w:val="Strong"/>
+          <w:b w:val="0"/>
+        </w:rPr>
+        <w:t>prompt engineering and business logic rules</w:t>
+      </w:r>
+      <w:r>
+        <w:t xml:space="preserve"> to ensure accurate SQL generation and reporting</w:t>
+      </w:r>
+    </w:p>
+    <w:p>
+      <w:pPr>
+        <w:tabs>
+          <w:tab w:val="left" w:pos="2835"/>
+          <w:tab w:val="left" w:pos="3261"/>
+        </w:tabs>
+        <w:spacing w:after="0"/>
+      </w:pPr>
+    </w:p>
+    <w:p>
+      <w:pPr>
+        <w:tabs>
+          <w:tab w:val="left" w:pos="2835"/>
+          <w:tab w:val="left" w:pos="3261"/>
+        </w:tabs>
+        <w:spacing w:after="0"/>
         <w:rPr>
           <w:b/>
         </w:rPr>
@@ -1594,6 +1717,8 @@
       <w:r>
         <w:t>Js</w:t>
       </w:r>
+      <w:bookmarkStart w:id="0" w:name="_GoBack"/>
+      <w:bookmarkEnd w:id="0"/>
       <w:proofErr w:type="spellEnd"/>
     </w:p>
     <w:p>
@@ -2008,6 +2133,7 @@
         <w:spacing w:after="0"/>
       </w:pPr>
       <w:r>
+        <w:lastRenderedPageBreak/>
         <w:t>Integrating APIs</w:t>
       </w:r>
     </w:p>
@@ -2107,7 +2233,6 @@
       </w:pPr>
       <w:proofErr w:type="spellStart"/>
       <w:r>
-        <w:lastRenderedPageBreak/>
         <w:t>Vue</w:t>
       </w:r>
       <w:proofErr w:type="spellEnd"/>
@@ -4535,6 +4660,7 @@
         <w:spacing w:after="0"/>
       </w:pPr>
       <w:r>
+        <w:lastRenderedPageBreak/>
         <w:t>Student Coordinator can see the all the reports of all organizations</w:t>
       </w:r>
     </w:p>
@@ -4599,7 +4725,6 @@
         <w:spacing w:after="0"/>
       </w:pPr>
       <w:r>
-        <w:lastRenderedPageBreak/>
         <w:t>SDO Director can see the all the reports of all organizations</w:t>
       </w:r>
     </w:p>
@@ -5232,7 +5357,6 @@
         <w:rPr>
           <w:szCs w:val="20"/>
         </w:rPr>
-        <w:lastRenderedPageBreak/>
         <w:t>Can play 2 players</w:t>
       </w:r>
     </w:p>
@@ -6925,6 +7049,7 @@
         <w:rPr>
           <w:szCs w:val="20"/>
         </w:rPr>
+        <w:lastRenderedPageBreak/>
         <w:t xml:space="preserve">CSS3 (More on Grid and </w:t>
       </w:r>
       <w:proofErr w:type="spellStart"/>
@@ -7018,762 +7143,762 @@
         <w:rPr>
           <w:szCs w:val="20"/>
         </w:rPr>
+        <w:t>Cabin Vista</w:t>
+      </w:r>
+      <w:r>
+        <w:rPr>
+          <w:szCs w:val="20"/>
+        </w:rPr>
+        <w:tab/>
+      </w:r>
+      <w:r>
+        <w:t>A feature-rich cabin reservation system that allows users to securely log in using their Gmail account, reserve cabins, and manage their bookings with ease. Users can rate their stay, update their profile, and enjoy a seamless user experience with strict access control for logged-in and logged-out users.</w:t>
+      </w:r>
+    </w:p>
+    <w:p>
+      <w:pPr>
+        <w:spacing w:after="0"/>
+        <w:rPr>
+          <w:szCs w:val="20"/>
+        </w:rPr>
+      </w:pPr>
+    </w:p>
+    <w:p>
+      <w:pPr>
+        <w:spacing w:after="0"/>
+        <w:ind w:left="2520" w:firstLine="360"/>
+        <w:rPr>
+          <w:b/>
+          <w:szCs w:val="20"/>
+        </w:rPr>
+      </w:pPr>
+      <w:r>
+        <w:rPr>
+          <w:b/>
+          <w:szCs w:val="20"/>
+        </w:rPr>
+        <w:t>Features</w:t>
+      </w:r>
+      <w:r>
+        <w:rPr>
+          <w:b/>
+          <w:szCs w:val="20"/>
+        </w:rPr>
+        <w:tab/>
+      </w:r>
+    </w:p>
+    <w:p>
+      <w:pPr>
+        <w:pStyle w:val="ListParagraph"/>
+        <w:numPr>
+          <w:ilvl w:val="0"/>
+          <w:numId w:val="19"/>
+        </w:numPr>
+        <w:spacing w:after="0"/>
+        <w:rPr>
+          <w:szCs w:val="20"/>
+        </w:rPr>
+      </w:pPr>
+      <w:r>
+        <w:rPr>
+          <w:szCs w:val="20"/>
+        </w:rPr>
+        <w:t xml:space="preserve">Can login using </w:t>
+      </w:r>
+      <w:proofErr w:type="spellStart"/>
+      <w:r>
+        <w:rPr>
+          <w:szCs w:val="20"/>
+        </w:rPr>
+        <w:t>gmail</w:t>
+      </w:r>
+      <w:proofErr w:type="spellEnd"/>
+      <w:r>
+        <w:rPr>
+          <w:szCs w:val="20"/>
+        </w:rPr>
+        <w:t xml:space="preserve"> account</w:t>
+      </w:r>
+    </w:p>
+    <w:p>
+      <w:pPr>
+        <w:pStyle w:val="ListParagraph"/>
+        <w:numPr>
+          <w:ilvl w:val="0"/>
+          <w:numId w:val="19"/>
+        </w:numPr>
+        <w:spacing w:after="0"/>
+        <w:rPr>
+          <w:szCs w:val="20"/>
+        </w:rPr>
+      </w:pPr>
+      <w:r>
+        <w:rPr>
+          <w:szCs w:val="20"/>
+        </w:rPr>
+        <w:t>Can logout</w:t>
+      </w:r>
+    </w:p>
+    <w:p>
+      <w:pPr>
+        <w:pStyle w:val="ListParagraph"/>
+        <w:numPr>
+          <w:ilvl w:val="0"/>
+          <w:numId w:val="19"/>
+        </w:numPr>
+        <w:spacing w:after="0"/>
+        <w:rPr>
+          <w:szCs w:val="20"/>
+        </w:rPr>
+      </w:pPr>
+      <w:r>
+        <w:rPr>
+          <w:szCs w:val="20"/>
+        </w:rPr>
+        <w:t>Logged in user can reserve cabin</w:t>
+      </w:r>
+    </w:p>
+    <w:p>
+      <w:pPr>
+        <w:pStyle w:val="ListParagraph"/>
+        <w:numPr>
+          <w:ilvl w:val="0"/>
+          <w:numId w:val="19"/>
+        </w:numPr>
+        <w:spacing w:after="0"/>
+        <w:rPr>
+          <w:szCs w:val="20"/>
+        </w:rPr>
+      </w:pPr>
+      <w:r>
+        <w:rPr>
+          <w:szCs w:val="20"/>
+        </w:rPr>
+        <w:t>Logged in user can manage his/her own reservation</w:t>
+      </w:r>
+    </w:p>
+    <w:p>
+      <w:pPr>
+        <w:pStyle w:val="ListParagraph"/>
+        <w:numPr>
+          <w:ilvl w:val="0"/>
+          <w:numId w:val="19"/>
+        </w:numPr>
+        <w:spacing w:after="0"/>
+        <w:rPr>
+          <w:szCs w:val="20"/>
+        </w:rPr>
+      </w:pPr>
+      <w:r>
+        <w:rPr>
+          <w:szCs w:val="20"/>
+        </w:rPr>
+        <w:t>Logged in user can rate the cabin</w:t>
+      </w:r>
+    </w:p>
+    <w:p>
+      <w:pPr>
+        <w:pStyle w:val="ListParagraph"/>
+        <w:numPr>
+          <w:ilvl w:val="0"/>
+          <w:numId w:val="19"/>
+        </w:numPr>
+        <w:spacing w:after="0"/>
+        <w:rPr>
+          <w:szCs w:val="20"/>
+        </w:rPr>
+      </w:pPr>
+      <w:r>
+        <w:rPr>
+          <w:szCs w:val="20"/>
+        </w:rPr>
+        <w:t>Logged in user can update profile</w:t>
+      </w:r>
+    </w:p>
+    <w:p>
+      <w:pPr>
+        <w:pStyle w:val="ListParagraph"/>
+        <w:numPr>
+          <w:ilvl w:val="0"/>
+          <w:numId w:val="19"/>
+        </w:numPr>
+        <w:spacing w:after="0"/>
+        <w:rPr>
+          <w:szCs w:val="20"/>
+        </w:rPr>
+      </w:pPr>
+      <w:r>
+        <w:rPr>
+          <w:szCs w:val="20"/>
+        </w:rPr>
+        <w:t>Logged out user can’t reserve cabin</w:t>
+      </w:r>
+    </w:p>
+    <w:p>
+      <w:pPr>
+        <w:pStyle w:val="ListParagraph"/>
+        <w:numPr>
+          <w:ilvl w:val="0"/>
+          <w:numId w:val="19"/>
+        </w:numPr>
+        <w:spacing w:after="0"/>
+        <w:rPr>
+          <w:szCs w:val="20"/>
+        </w:rPr>
+      </w:pPr>
+      <w:r>
+        <w:rPr>
+          <w:szCs w:val="20"/>
+        </w:rPr>
+        <w:t>Logged out user can’t manage his/her own reservation</w:t>
+      </w:r>
+    </w:p>
+    <w:p>
+      <w:pPr>
+        <w:pStyle w:val="ListParagraph"/>
+        <w:numPr>
+          <w:ilvl w:val="0"/>
+          <w:numId w:val="19"/>
+        </w:numPr>
+        <w:spacing w:after="0"/>
+        <w:rPr>
+          <w:szCs w:val="20"/>
+        </w:rPr>
+      </w:pPr>
+      <w:r>
+        <w:rPr>
+          <w:szCs w:val="20"/>
+        </w:rPr>
+        <w:t>Logged out user can’t rate the cabin</w:t>
+      </w:r>
+    </w:p>
+    <w:p>
+      <w:pPr>
+        <w:pStyle w:val="ListParagraph"/>
+        <w:numPr>
+          <w:ilvl w:val="0"/>
+          <w:numId w:val="19"/>
+        </w:numPr>
+        <w:spacing w:after="0"/>
+        <w:rPr>
+          <w:szCs w:val="20"/>
+        </w:rPr>
+      </w:pPr>
+      <w:r>
+        <w:rPr>
+          <w:szCs w:val="20"/>
+        </w:rPr>
+        <w:t>Logged out user can’t update profile</w:t>
+      </w:r>
+    </w:p>
+    <w:p>
+      <w:pPr>
+        <w:spacing w:after="0"/>
+        <w:rPr>
+          <w:szCs w:val="20"/>
+        </w:rPr>
+      </w:pPr>
+    </w:p>
+    <w:p>
+      <w:pPr>
+        <w:spacing w:after="0"/>
+        <w:ind w:left="2880"/>
+        <w:rPr>
+          <w:b/>
+          <w:szCs w:val="20"/>
+        </w:rPr>
+      </w:pPr>
+      <w:r>
+        <w:rPr>
+          <w:b/>
+          <w:szCs w:val="20"/>
+        </w:rPr>
+        <w:t>Tech Stack</w:t>
+      </w:r>
+    </w:p>
+    <w:p>
+      <w:pPr>
+        <w:pStyle w:val="ListParagraph"/>
+        <w:numPr>
+          <w:ilvl w:val="0"/>
+          <w:numId w:val="14"/>
+        </w:numPr>
+        <w:spacing w:after="0"/>
+        <w:rPr>
+          <w:szCs w:val="20"/>
+        </w:rPr>
+      </w:pPr>
+      <w:r>
+        <w:rPr>
+          <w:szCs w:val="20"/>
+        </w:rPr>
+        <w:t xml:space="preserve">Next </w:t>
+      </w:r>
+      <w:proofErr w:type="spellStart"/>
+      <w:r>
+        <w:rPr>
+          <w:szCs w:val="20"/>
+        </w:rPr>
+        <w:t>Js</w:t>
+      </w:r>
+      <w:proofErr w:type="spellEnd"/>
+    </w:p>
+    <w:p>
+      <w:pPr>
+        <w:pStyle w:val="ListParagraph"/>
+        <w:numPr>
+          <w:ilvl w:val="0"/>
+          <w:numId w:val="14"/>
+        </w:numPr>
+        <w:spacing w:after="0"/>
+        <w:rPr>
+          <w:szCs w:val="20"/>
+        </w:rPr>
+      </w:pPr>
+      <w:r>
+        <w:rPr>
+          <w:szCs w:val="20"/>
+        </w:rPr>
+        <w:t xml:space="preserve">Tailwind </w:t>
+      </w:r>
+      <w:proofErr w:type="spellStart"/>
+      <w:r>
+        <w:rPr>
+          <w:szCs w:val="20"/>
+        </w:rPr>
+        <w:t>Css</w:t>
+      </w:r>
+      <w:proofErr w:type="spellEnd"/>
+    </w:p>
+    <w:p>
+      <w:pPr>
+        <w:pStyle w:val="ListParagraph"/>
+        <w:numPr>
+          <w:ilvl w:val="0"/>
+          <w:numId w:val="14"/>
+        </w:numPr>
+        <w:spacing w:after="0"/>
+        <w:rPr>
+          <w:szCs w:val="20"/>
+        </w:rPr>
+      </w:pPr>
+      <w:r>
+        <w:rPr>
+          <w:szCs w:val="20"/>
+        </w:rPr>
+        <w:t>Server Actions for mutation of data</w:t>
+      </w:r>
+    </w:p>
+    <w:p>
+      <w:pPr>
+        <w:pStyle w:val="ListParagraph"/>
+        <w:numPr>
+          <w:ilvl w:val="0"/>
+          <w:numId w:val="14"/>
+        </w:numPr>
+        <w:spacing w:after="0"/>
+        <w:rPr>
+          <w:szCs w:val="20"/>
+        </w:rPr>
+      </w:pPr>
+      <w:proofErr w:type="spellStart"/>
+      <w:r>
+        <w:rPr>
+          <w:szCs w:val="20"/>
+        </w:rPr>
+        <w:t>Supabase</w:t>
+      </w:r>
+      <w:proofErr w:type="spellEnd"/>
+      <w:r>
+        <w:rPr>
+          <w:szCs w:val="20"/>
+        </w:rPr>
+        <w:t xml:space="preserve"> for backend</w:t>
+      </w:r>
+      <w:r>
+        <w:rPr>
+          <w:szCs w:val="20"/>
+        </w:rPr>
+        <w:t xml:space="preserve"> (It is alternative for firebase)</w:t>
+      </w:r>
+    </w:p>
+    <w:p>
+      <w:pPr>
+        <w:pStyle w:val="ListParagraph"/>
+        <w:numPr>
+          <w:ilvl w:val="0"/>
+          <w:numId w:val="14"/>
+        </w:numPr>
+        <w:spacing w:after="0"/>
+        <w:rPr>
+          <w:szCs w:val="20"/>
+        </w:rPr>
+      </w:pPr>
+      <w:proofErr w:type="spellStart"/>
+      <w:r>
+        <w:rPr>
+          <w:szCs w:val="20"/>
+        </w:rPr>
+        <w:t>PostgreSQL</w:t>
+      </w:r>
+      <w:proofErr w:type="spellEnd"/>
+    </w:p>
+    <w:p>
+      <w:pPr>
+        <w:spacing w:after="0"/>
+        <w:rPr>
+          <w:szCs w:val="20"/>
+        </w:rPr>
+      </w:pPr>
+    </w:p>
+    <w:p>
+      <w:pPr>
+        <w:spacing w:after="0"/>
+        <w:rPr>
+          <w:szCs w:val="20"/>
+        </w:rPr>
+      </w:pPr>
+    </w:p>
+    <w:p>
+      <w:pPr>
+        <w:spacing w:after="0"/>
+        <w:rPr>
+          <w:szCs w:val="20"/>
+        </w:rPr>
+      </w:pPr>
+    </w:p>
+    <w:p>
+      <w:pPr>
+        <w:spacing w:after="0"/>
+        <w:ind w:left="2880" w:hanging="2880"/>
+        <w:rPr>
+          <w:szCs w:val="20"/>
+        </w:rPr>
+      </w:pPr>
+      <w:r>
+        <w:rPr>
+          <w:szCs w:val="20"/>
+        </w:rPr>
+        <w:t xml:space="preserve">Cabin </w:t>
+      </w:r>
+      <w:r>
+        <w:rPr>
+          <w:szCs w:val="20"/>
+        </w:rPr>
+        <w:t>Management App</w:t>
+      </w:r>
+      <w:r>
+        <w:rPr>
+          <w:szCs w:val="20"/>
+        </w:rPr>
+        <w:tab/>
+      </w:r>
+      <w:r>
+        <w:t>A comprehensive system for managing cabin reservations, user accounts, and detailed cabin information. This app provides an intuitive admin dashboard with detailed statistics, booking management, and access control for both regular users and admins.</w:t>
+      </w:r>
+    </w:p>
+    <w:p>
+      <w:pPr>
+        <w:spacing w:after="0"/>
+        <w:rPr>
+          <w:szCs w:val="20"/>
+        </w:rPr>
+      </w:pPr>
+    </w:p>
+    <w:p>
+      <w:pPr>
+        <w:spacing w:after="0"/>
+        <w:ind w:left="2160" w:firstLine="720"/>
+        <w:rPr>
+          <w:b/>
+          <w:szCs w:val="20"/>
+        </w:rPr>
+      </w:pPr>
+      <w:r>
+        <w:rPr>
+          <w:b/>
+          <w:szCs w:val="20"/>
+        </w:rPr>
+        <w:t>Features</w:t>
+      </w:r>
+      <w:r>
+        <w:rPr>
+          <w:b/>
+          <w:szCs w:val="20"/>
+        </w:rPr>
+        <w:tab/>
+      </w:r>
+    </w:p>
+    <w:p>
+      <w:pPr>
+        <w:pStyle w:val="ListParagraph"/>
+        <w:numPr>
+          <w:ilvl w:val="0"/>
+          <w:numId w:val="19"/>
+        </w:numPr>
+        <w:spacing w:after="0"/>
+        <w:rPr>
+          <w:szCs w:val="20"/>
+        </w:rPr>
+      </w:pPr>
+      <w:r>
+        <w:rPr>
+          <w:szCs w:val="20"/>
+        </w:rPr>
+        <w:t>Can register user</w:t>
+      </w:r>
+    </w:p>
+    <w:p>
+      <w:pPr>
+        <w:pStyle w:val="ListParagraph"/>
+        <w:numPr>
+          <w:ilvl w:val="0"/>
+          <w:numId w:val="19"/>
+        </w:numPr>
+        <w:spacing w:after="0"/>
+        <w:rPr>
+          <w:szCs w:val="20"/>
+        </w:rPr>
+      </w:pPr>
+      <w:r>
+        <w:rPr>
+          <w:szCs w:val="20"/>
+        </w:rPr>
+        <w:t>Can Login and Logout</w:t>
+      </w:r>
+    </w:p>
+    <w:p>
+      <w:pPr>
+        <w:pStyle w:val="ListParagraph"/>
+        <w:numPr>
+          <w:ilvl w:val="0"/>
+          <w:numId w:val="19"/>
+        </w:numPr>
+        <w:spacing w:after="0"/>
+        <w:rPr>
+          <w:szCs w:val="20"/>
+        </w:rPr>
+      </w:pPr>
+      <w:r>
+        <w:rPr>
+          <w:szCs w:val="20"/>
+        </w:rPr>
+        <w:t>Can update user details, upload profile image and password (logged-in user)</w:t>
+      </w:r>
+    </w:p>
+    <w:p>
+      <w:pPr>
+        <w:pStyle w:val="ListParagraph"/>
+        <w:numPr>
+          <w:ilvl w:val="0"/>
+          <w:numId w:val="19"/>
+        </w:numPr>
+        <w:spacing w:after="0"/>
+        <w:rPr>
+          <w:szCs w:val="20"/>
+        </w:rPr>
+      </w:pPr>
+      <w:r>
+        <w:rPr>
+          <w:szCs w:val="20"/>
+        </w:rPr>
+        <w:t>Dashboard with statistics of bookings, sales, checked-ins, occupancy rate and more (logged-in user)</w:t>
+      </w:r>
+    </w:p>
+    <w:p>
+      <w:pPr>
+        <w:pStyle w:val="ListParagraph"/>
+        <w:numPr>
+          <w:ilvl w:val="0"/>
+          <w:numId w:val="19"/>
+        </w:numPr>
+        <w:spacing w:after="0"/>
+        <w:rPr>
+          <w:szCs w:val="20"/>
+        </w:rPr>
+      </w:pPr>
+      <w:r>
+        <w:rPr>
+          <w:szCs w:val="20"/>
+        </w:rPr>
+        <w:t>Can manage bookings of the guests (logged-in user)</w:t>
+      </w:r>
+    </w:p>
+    <w:p>
+      <w:pPr>
+        <w:pStyle w:val="ListParagraph"/>
+        <w:numPr>
+          <w:ilvl w:val="0"/>
+          <w:numId w:val="19"/>
+        </w:numPr>
+        <w:spacing w:after="0"/>
+        <w:rPr>
+          <w:szCs w:val="20"/>
+        </w:rPr>
+      </w:pPr>
+      <w:r>
+        <w:rPr>
+          <w:szCs w:val="20"/>
+        </w:rPr>
+        <w:t>Can create cabin details to show in main website (logged-in user)</w:t>
+      </w:r>
+    </w:p>
+    <w:p>
+      <w:pPr>
+        <w:pStyle w:val="ListParagraph"/>
+        <w:numPr>
+          <w:ilvl w:val="0"/>
+          <w:numId w:val="19"/>
+        </w:numPr>
+        <w:spacing w:after="0"/>
+        <w:rPr>
+          <w:szCs w:val="20"/>
+        </w:rPr>
+      </w:pPr>
+      <w:r>
+        <w:rPr>
+          <w:szCs w:val="20"/>
+        </w:rPr>
+        <w:t>Can see the guest ratings (logged-in user)</w:t>
+      </w:r>
+    </w:p>
+    <w:p>
+      <w:pPr>
+        <w:pStyle w:val="ListParagraph"/>
+        <w:numPr>
+          <w:ilvl w:val="0"/>
+          <w:numId w:val="19"/>
+        </w:numPr>
+        <w:spacing w:after="0"/>
+        <w:rPr>
+          <w:szCs w:val="20"/>
+        </w:rPr>
+      </w:pPr>
+      <w:r>
+        <w:rPr>
+          <w:szCs w:val="20"/>
+        </w:rPr>
+        <w:t>Can add testimonial to show in main website (logged-in user)</w:t>
+      </w:r>
+    </w:p>
+    <w:p>
+      <w:pPr>
+        <w:pStyle w:val="ListParagraph"/>
+        <w:numPr>
+          <w:ilvl w:val="0"/>
+          <w:numId w:val="19"/>
+        </w:numPr>
+        <w:spacing w:after="0"/>
+        <w:rPr>
+          <w:szCs w:val="20"/>
+        </w:rPr>
+      </w:pPr>
+      <w:r>
+        <w:rPr>
+          <w:szCs w:val="20"/>
+        </w:rPr>
+        <w:t>Can create another user (admin logged-in user)</w:t>
+      </w:r>
+    </w:p>
+    <w:p>
+      <w:pPr>
+        <w:pStyle w:val="ListParagraph"/>
+        <w:numPr>
+          <w:ilvl w:val="0"/>
+          <w:numId w:val="19"/>
+        </w:numPr>
+        <w:spacing w:after="0"/>
+        <w:rPr>
+          <w:szCs w:val="20"/>
+        </w:rPr>
+      </w:pPr>
+      <w:r>
+        <w:rPr>
+          <w:szCs w:val="20"/>
+        </w:rPr>
+        <w:t>Can’t create another user (non-admin logged-in user)</w:t>
+      </w:r>
+    </w:p>
+    <w:p>
+      <w:pPr>
+        <w:pStyle w:val="ListParagraph"/>
+        <w:numPr>
+          <w:ilvl w:val="0"/>
+          <w:numId w:val="19"/>
+        </w:numPr>
+        <w:spacing w:after="0"/>
+        <w:rPr>
+          <w:szCs w:val="20"/>
+        </w:rPr>
+      </w:pPr>
+      <w:r>
+        <w:rPr>
+          <w:szCs w:val="20"/>
+        </w:rPr>
+        <w:t>Can set the settings of every cabin (logged-in user)</w:t>
+      </w:r>
+    </w:p>
+    <w:p>
+      <w:pPr>
+        <w:pStyle w:val="ListParagraph"/>
+        <w:numPr>
+          <w:ilvl w:val="0"/>
+          <w:numId w:val="19"/>
+        </w:numPr>
+        <w:spacing w:after="0"/>
+        <w:rPr>
+          <w:szCs w:val="20"/>
+        </w:rPr>
+      </w:pPr>
+      <w:r>
+        <w:rPr>
+          <w:szCs w:val="20"/>
+        </w:rPr>
+        <w:t>Pagination ( Server and Client side )</w:t>
+      </w:r>
+    </w:p>
+    <w:p>
+      <w:pPr>
+        <w:spacing w:after="0"/>
+        <w:rPr>
+          <w:szCs w:val="20"/>
+        </w:rPr>
+      </w:pPr>
+    </w:p>
+    <w:p>
+      <w:pPr>
+        <w:spacing w:after="0"/>
+        <w:ind w:left="2880"/>
+        <w:rPr>
+          <w:b/>
+          <w:szCs w:val="20"/>
+        </w:rPr>
+      </w:pPr>
+      <w:r>
+        <w:rPr>
+          <w:b/>
+          <w:szCs w:val="20"/>
+        </w:rPr>
+        <w:t>Tech Stack</w:t>
+      </w:r>
+    </w:p>
+    <w:p>
+      <w:pPr>
+        <w:pStyle w:val="ListParagraph"/>
+        <w:numPr>
+          <w:ilvl w:val="0"/>
+          <w:numId w:val="14"/>
+        </w:numPr>
+        <w:spacing w:after="0"/>
+        <w:rPr>
+          <w:szCs w:val="20"/>
+        </w:rPr>
+      </w:pPr>
+      <w:r>
+        <w:rPr>
+          <w:szCs w:val="20"/>
+        </w:rPr>
         <w:lastRenderedPageBreak/>
-        <w:t>Cabin Vista</w:t>
-      </w:r>
-      <w:r>
-        <w:rPr>
-          <w:szCs w:val="20"/>
-        </w:rPr>
-        <w:tab/>
-      </w:r>
-      <w:r>
-        <w:t>A feature-rich cabin reservation system that allows users to securely log in using their Gmail account, reserve cabins, and manage their bookings with ease. Users can rate their stay, update their profile, and enjoy a seamless user experience with strict access control for logged-in and logged-out users.</w:t>
-      </w:r>
-    </w:p>
-    <w:p>
-      <w:pPr>
-        <w:spacing w:after="0"/>
-        <w:rPr>
-          <w:szCs w:val="20"/>
-        </w:rPr>
-      </w:pPr>
-    </w:p>
-    <w:p>
-      <w:pPr>
-        <w:spacing w:after="0"/>
-        <w:ind w:left="2520" w:firstLine="360"/>
-        <w:rPr>
-          <w:b/>
-          <w:szCs w:val="20"/>
-        </w:rPr>
-      </w:pPr>
-      <w:r>
-        <w:rPr>
-          <w:b/>
-          <w:szCs w:val="20"/>
-        </w:rPr>
-        <w:t>Features</w:t>
-      </w:r>
-      <w:r>
-        <w:rPr>
-          <w:b/>
-          <w:szCs w:val="20"/>
-        </w:rPr>
-        <w:tab/>
-      </w:r>
-    </w:p>
-    <w:p>
-      <w:pPr>
-        <w:pStyle w:val="ListParagraph"/>
-        <w:numPr>
-          <w:ilvl w:val="0"/>
-          <w:numId w:val="19"/>
-        </w:numPr>
-        <w:spacing w:after="0"/>
-        <w:rPr>
-          <w:szCs w:val="20"/>
-        </w:rPr>
-      </w:pPr>
-      <w:r>
-        <w:rPr>
-          <w:szCs w:val="20"/>
-        </w:rPr>
-        <w:t xml:space="preserve">Can login using </w:t>
-      </w:r>
-      <w:proofErr w:type="spellStart"/>
-      <w:r>
-        <w:rPr>
-          <w:szCs w:val="20"/>
-        </w:rPr>
-        <w:t>gmail</w:t>
-      </w:r>
-      <w:proofErr w:type="spellEnd"/>
-      <w:r>
-        <w:rPr>
-          <w:szCs w:val="20"/>
-        </w:rPr>
-        <w:t xml:space="preserve"> account</w:t>
-      </w:r>
-    </w:p>
-    <w:p>
-      <w:pPr>
-        <w:pStyle w:val="ListParagraph"/>
-        <w:numPr>
-          <w:ilvl w:val="0"/>
-          <w:numId w:val="19"/>
-        </w:numPr>
-        <w:spacing w:after="0"/>
-        <w:rPr>
-          <w:szCs w:val="20"/>
-        </w:rPr>
-      </w:pPr>
-      <w:r>
-        <w:rPr>
-          <w:szCs w:val="20"/>
-        </w:rPr>
-        <w:t>Can logout</w:t>
-      </w:r>
-    </w:p>
-    <w:p>
-      <w:pPr>
-        <w:pStyle w:val="ListParagraph"/>
-        <w:numPr>
-          <w:ilvl w:val="0"/>
-          <w:numId w:val="19"/>
-        </w:numPr>
-        <w:spacing w:after="0"/>
-        <w:rPr>
-          <w:szCs w:val="20"/>
-        </w:rPr>
-      </w:pPr>
-      <w:r>
-        <w:rPr>
-          <w:szCs w:val="20"/>
-        </w:rPr>
-        <w:t>Logged in user can reserve cabin</w:t>
-      </w:r>
-    </w:p>
-    <w:p>
-      <w:pPr>
-        <w:pStyle w:val="ListParagraph"/>
-        <w:numPr>
-          <w:ilvl w:val="0"/>
-          <w:numId w:val="19"/>
-        </w:numPr>
-        <w:spacing w:after="0"/>
-        <w:rPr>
-          <w:szCs w:val="20"/>
-        </w:rPr>
-      </w:pPr>
-      <w:r>
-        <w:rPr>
-          <w:szCs w:val="20"/>
-        </w:rPr>
-        <w:t>Logged in user can manage his/her own reservation</w:t>
-      </w:r>
-    </w:p>
-    <w:p>
-      <w:pPr>
-        <w:pStyle w:val="ListParagraph"/>
-        <w:numPr>
-          <w:ilvl w:val="0"/>
-          <w:numId w:val="19"/>
-        </w:numPr>
-        <w:spacing w:after="0"/>
-        <w:rPr>
-          <w:szCs w:val="20"/>
-        </w:rPr>
-      </w:pPr>
-      <w:r>
-        <w:rPr>
-          <w:szCs w:val="20"/>
-        </w:rPr>
-        <w:t>Logged in user can rate the cabin</w:t>
-      </w:r>
-    </w:p>
-    <w:p>
-      <w:pPr>
-        <w:pStyle w:val="ListParagraph"/>
-        <w:numPr>
-          <w:ilvl w:val="0"/>
-          <w:numId w:val="19"/>
-        </w:numPr>
-        <w:spacing w:after="0"/>
-        <w:rPr>
-          <w:szCs w:val="20"/>
-        </w:rPr>
-      </w:pPr>
-      <w:r>
-        <w:rPr>
-          <w:szCs w:val="20"/>
-        </w:rPr>
-        <w:t>Logged in user can update profile</w:t>
-      </w:r>
-    </w:p>
-    <w:p>
-      <w:pPr>
-        <w:pStyle w:val="ListParagraph"/>
-        <w:numPr>
-          <w:ilvl w:val="0"/>
-          <w:numId w:val="19"/>
-        </w:numPr>
-        <w:spacing w:after="0"/>
-        <w:rPr>
-          <w:szCs w:val="20"/>
-        </w:rPr>
-      </w:pPr>
-      <w:r>
-        <w:rPr>
-          <w:szCs w:val="20"/>
-        </w:rPr>
-        <w:t>Logged out user can’t reserve cabin</w:t>
-      </w:r>
-    </w:p>
-    <w:p>
-      <w:pPr>
-        <w:pStyle w:val="ListParagraph"/>
-        <w:numPr>
-          <w:ilvl w:val="0"/>
-          <w:numId w:val="19"/>
-        </w:numPr>
-        <w:spacing w:after="0"/>
-        <w:rPr>
-          <w:szCs w:val="20"/>
-        </w:rPr>
-      </w:pPr>
-      <w:r>
-        <w:rPr>
-          <w:szCs w:val="20"/>
-        </w:rPr>
-        <w:t>Logged out user can’t manage his/her own reservation</w:t>
-      </w:r>
-    </w:p>
-    <w:p>
-      <w:pPr>
-        <w:pStyle w:val="ListParagraph"/>
-        <w:numPr>
-          <w:ilvl w:val="0"/>
-          <w:numId w:val="19"/>
-        </w:numPr>
-        <w:spacing w:after="0"/>
-        <w:rPr>
-          <w:szCs w:val="20"/>
-        </w:rPr>
-      </w:pPr>
-      <w:r>
-        <w:rPr>
-          <w:szCs w:val="20"/>
-        </w:rPr>
-        <w:t>Logged out user can’t rate the cabin</w:t>
-      </w:r>
-    </w:p>
-    <w:p>
-      <w:pPr>
-        <w:pStyle w:val="ListParagraph"/>
-        <w:numPr>
-          <w:ilvl w:val="0"/>
-          <w:numId w:val="19"/>
-        </w:numPr>
-        <w:spacing w:after="0"/>
-        <w:rPr>
-          <w:szCs w:val="20"/>
-        </w:rPr>
-      </w:pPr>
-      <w:r>
-        <w:rPr>
-          <w:szCs w:val="20"/>
-        </w:rPr>
-        <w:t>Logged out user can’t update profile</w:t>
-      </w:r>
-    </w:p>
-    <w:p>
-      <w:pPr>
-        <w:spacing w:after="0"/>
-        <w:rPr>
-          <w:szCs w:val="20"/>
-        </w:rPr>
-      </w:pPr>
-    </w:p>
-    <w:p>
-      <w:pPr>
-        <w:spacing w:after="0"/>
-        <w:ind w:left="2880"/>
-        <w:rPr>
-          <w:b/>
-          <w:szCs w:val="20"/>
-        </w:rPr>
-      </w:pPr>
-      <w:r>
-        <w:rPr>
-          <w:b/>
-          <w:szCs w:val="20"/>
-        </w:rPr>
-        <w:t>Tech Stack</w:t>
-      </w:r>
-    </w:p>
-    <w:p>
-      <w:pPr>
-        <w:pStyle w:val="ListParagraph"/>
-        <w:numPr>
-          <w:ilvl w:val="0"/>
-          <w:numId w:val="14"/>
-        </w:numPr>
-        <w:spacing w:after="0"/>
-        <w:rPr>
-          <w:szCs w:val="20"/>
-        </w:rPr>
-      </w:pPr>
-      <w:r>
-        <w:rPr>
-          <w:szCs w:val="20"/>
-        </w:rPr>
-        <w:t xml:space="preserve">Next </w:t>
-      </w:r>
-      <w:proofErr w:type="spellStart"/>
-      <w:r>
-        <w:rPr>
-          <w:szCs w:val="20"/>
-        </w:rPr>
-        <w:t>Js</w:t>
-      </w:r>
-      <w:proofErr w:type="spellEnd"/>
-    </w:p>
-    <w:p>
-      <w:pPr>
-        <w:pStyle w:val="ListParagraph"/>
-        <w:numPr>
-          <w:ilvl w:val="0"/>
-          <w:numId w:val="14"/>
-        </w:numPr>
-        <w:spacing w:after="0"/>
-        <w:rPr>
-          <w:szCs w:val="20"/>
-        </w:rPr>
-      </w:pPr>
-      <w:r>
-        <w:rPr>
-          <w:szCs w:val="20"/>
-        </w:rPr>
-        <w:t xml:space="preserve">Tailwind </w:t>
-      </w:r>
-      <w:proofErr w:type="spellStart"/>
-      <w:r>
-        <w:rPr>
-          <w:szCs w:val="20"/>
-        </w:rPr>
-        <w:t>Css</w:t>
-      </w:r>
-      <w:proofErr w:type="spellEnd"/>
-    </w:p>
-    <w:p>
-      <w:pPr>
-        <w:pStyle w:val="ListParagraph"/>
-        <w:numPr>
-          <w:ilvl w:val="0"/>
-          <w:numId w:val="14"/>
-        </w:numPr>
-        <w:spacing w:after="0"/>
-        <w:rPr>
-          <w:szCs w:val="20"/>
-        </w:rPr>
-      </w:pPr>
-      <w:r>
-        <w:rPr>
-          <w:szCs w:val="20"/>
-        </w:rPr>
-        <w:t>Server Actions for mutation of data</w:t>
-      </w:r>
-    </w:p>
-    <w:p>
-      <w:pPr>
-        <w:pStyle w:val="ListParagraph"/>
-        <w:numPr>
-          <w:ilvl w:val="0"/>
-          <w:numId w:val="14"/>
-        </w:numPr>
-        <w:spacing w:after="0"/>
-        <w:rPr>
-          <w:szCs w:val="20"/>
-        </w:rPr>
-      </w:pPr>
-      <w:proofErr w:type="spellStart"/>
-      <w:r>
-        <w:rPr>
-          <w:szCs w:val="20"/>
-        </w:rPr>
-        <w:t>Supabase</w:t>
-      </w:r>
-      <w:proofErr w:type="spellEnd"/>
-      <w:r>
-        <w:rPr>
-          <w:szCs w:val="20"/>
-        </w:rPr>
-        <w:t xml:space="preserve"> for backend</w:t>
-      </w:r>
-      <w:r>
-        <w:rPr>
-          <w:szCs w:val="20"/>
-        </w:rPr>
-        <w:t xml:space="preserve"> (It is alternative for firebase)</w:t>
-      </w:r>
-    </w:p>
-    <w:p>
-      <w:pPr>
-        <w:pStyle w:val="ListParagraph"/>
-        <w:numPr>
-          <w:ilvl w:val="0"/>
-          <w:numId w:val="14"/>
-        </w:numPr>
-        <w:spacing w:after="0"/>
-        <w:rPr>
-          <w:szCs w:val="20"/>
-        </w:rPr>
-      </w:pPr>
-      <w:proofErr w:type="spellStart"/>
-      <w:r>
-        <w:rPr>
-          <w:szCs w:val="20"/>
-        </w:rPr>
-        <w:t>PostgreSQL</w:t>
-      </w:r>
-      <w:proofErr w:type="spellEnd"/>
-    </w:p>
-    <w:p>
-      <w:pPr>
-        <w:spacing w:after="0"/>
-        <w:rPr>
-          <w:szCs w:val="20"/>
-        </w:rPr>
-      </w:pPr>
-    </w:p>
-    <w:p>
-      <w:pPr>
-        <w:spacing w:after="0"/>
-        <w:rPr>
-          <w:szCs w:val="20"/>
-        </w:rPr>
-      </w:pPr>
-    </w:p>
-    <w:p>
-      <w:pPr>
-        <w:spacing w:after="0"/>
-        <w:rPr>
-          <w:szCs w:val="20"/>
-        </w:rPr>
-      </w:pPr>
-    </w:p>
-    <w:p>
-      <w:pPr>
-        <w:spacing w:after="0"/>
-        <w:ind w:left="2880" w:hanging="2880"/>
-        <w:rPr>
-          <w:szCs w:val="20"/>
-        </w:rPr>
-      </w:pPr>
-      <w:r>
-        <w:rPr>
-          <w:szCs w:val="20"/>
-        </w:rPr>
-        <w:t xml:space="preserve">Cabin </w:t>
-      </w:r>
-      <w:r>
-        <w:rPr>
-          <w:szCs w:val="20"/>
-        </w:rPr>
-        <w:t>Management App</w:t>
-      </w:r>
-      <w:r>
-        <w:rPr>
-          <w:szCs w:val="20"/>
-        </w:rPr>
-        <w:tab/>
-      </w:r>
-      <w:r>
-        <w:t>A comprehensive system for managing cabin reservations, user accounts, and detailed cabin information. This app provides an intuitive admin dashboard with detailed statistics, booking management, and access control for both regular users and admins.</w:t>
-      </w:r>
-    </w:p>
-    <w:p>
-      <w:pPr>
-        <w:spacing w:after="0"/>
-        <w:rPr>
-          <w:szCs w:val="20"/>
-        </w:rPr>
-      </w:pPr>
-    </w:p>
-    <w:p>
-      <w:pPr>
-        <w:spacing w:after="0"/>
-        <w:ind w:left="2160" w:firstLine="720"/>
-        <w:rPr>
-          <w:b/>
-          <w:szCs w:val="20"/>
-        </w:rPr>
-      </w:pPr>
-      <w:r>
-        <w:rPr>
-          <w:b/>
-          <w:szCs w:val="20"/>
-        </w:rPr>
-        <w:t>Features</w:t>
-      </w:r>
-      <w:r>
-        <w:rPr>
-          <w:b/>
-          <w:szCs w:val="20"/>
-        </w:rPr>
-        <w:tab/>
-      </w:r>
-    </w:p>
-    <w:p>
-      <w:pPr>
-        <w:pStyle w:val="ListParagraph"/>
-        <w:numPr>
-          <w:ilvl w:val="0"/>
-          <w:numId w:val="19"/>
-        </w:numPr>
-        <w:spacing w:after="0"/>
-        <w:rPr>
-          <w:szCs w:val="20"/>
-        </w:rPr>
-      </w:pPr>
-      <w:r>
-        <w:rPr>
-          <w:szCs w:val="20"/>
-        </w:rPr>
-        <w:t>Can register user</w:t>
-      </w:r>
-    </w:p>
-    <w:p>
-      <w:pPr>
-        <w:pStyle w:val="ListParagraph"/>
-        <w:numPr>
-          <w:ilvl w:val="0"/>
-          <w:numId w:val="19"/>
-        </w:numPr>
-        <w:spacing w:after="0"/>
-        <w:rPr>
-          <w:szCs w:val="20"/>
-        </w:rPr>
-      </w:pPr>
-      <w:r>
-        <w:rPr>
-          <w:szCs w:val="20"/>
-        </w:rPr>
-        <w:t>Can Login and Logout</w:t>
-      </w:r>
-    </w:p>
-    <w:p>
-      <w:pPr>
-        <w:pStyle w:val="ListParagraph"/>
-        <w:numPr>
-          <w:ilvl w:val="0"/>
-          <w:numId w:val="19"/>
-        </w:numPr>
-        <w:spacing w:after="0"/>
-        <w:rPr>
-          <w:szCs w:val="20"/>
-        </w:rPr>
-      </w:pPr>
-      <w:r>
-        <w:rPr>
-          <w:szCs w:val="20"/>
-        </w:rPr>
-        <w:t>Can update user details, upload profile image and password (logged-in user)</w:t>
-      </w:r>
-    </w:p>
-    <w:p>
-      <w:pPr>
-        <w:pStyle w:val="ListParagraph"/>
-        <w:numPr>
-          <w:ilvl w:val="0"/>
-          <w:numId w:val="19"/>
-        </w:numPr>
-        <w:spacing w:after="0"/>
-        <w:rPr>
-          <w:szCs w:val="20"/>
-        </w:rPr>
-      </w:pPr>
-      <w:r>
-        <w:rPr>
-          <w:szCs w:val="20"/>
-        </w:rPr>
-        <w:t>Dashboard with statistics of bookings, sales, checked-ins, occupancy rate and more (logged-in user)</w:t>
-      </w:r>
-    </w:p>
-    <w:p>
-      <w:pPr>
-        <w:pStyle w:val="ListParagraph"/>
-        <w:numPr>
-          <w:ilvl w:val="0"/>
-          <w:numId w:val="19"/>
-        </w:numPr>
-        <w:spacing w:after="0"/>
-        <w:rPr>
-          <w:szCs w:val="20"/>
-        </w:rPr>
-      </w:pPr>
-      <w:r>
-        <w:rPr>
-          <w:szCs w:val="20"/>
-        </w:rPr>
-        <w:t>Can manage bookings of the guests (logged-in user)</w:t>
-      </w:r>
-    </w:p>
-    <w:p>
-      <w:pPr>
-        <w:pStyle w:val="ListParagraph"/>
-        <w:numPr>
-          <w:ilvl w:val="0"/>
-          <w:numId w:val="19"/>
-        </w:numPr>
-        <w:spacing w:after="0"/>
-        <w:rPr>
-          <w:szCs w:val="20"/>
-        </w:rPr>
-      </w:pPr>
-      <w:r>
-        <w:rPr>
-          <w:szCs w:val="20"/>
-        </w:rPr>
-        <w:t>Can create cabin details to show in main website (logged-in user)</w:t>
-      </w:r>
-    </w:p>
-    <w:p>
-      <w:pPr>
-        <w:pStyle w:val="ListParagraph"/>
-        <w:numPr>
-          <w:ilvl w:val="0"/>
-          <w:numId w:val="19"/>
-        </w:numPr>
-        <w:spacing w:after="0"/>
-        <w:rPr>
-          <w:szCs w:val="20"/>
-        </w:rPr>
-      </w:pPr>
-      <w:r>
-        <w:rPr>
-          <w:szCs w:val="20"/>
-        </w:rPr>
-        <w:t>Can see the guest ratings (logged-in user)</w:t>
-      </w:r>
-    </w:p>
-    <w:p>
-      <w:pPr>
-        <w:pStyle w:val="ListParagraph"/>
-        <w:numPr>
-          <w:ilvl w:val="0"/>
-          <w:numId w:val="19"/>
-        </w:numPr>
-        <w:spacing w:after="0"/>
-        <w:rPr>
-          <w:szCs w:val="20"/>
-        </w:rPr>
-      </w:pPr>
-      <w:r>
-        <w:rPr>
-          <w:szCs w:val="20"/>
-        </w:rPr>
-        <w:t>Can add testimonial to show in main website (logged-in user)</w:t>
-      </w:r>
-    </w:p>
-    <w:p>
-      <w:pPr>
-        <w:pStyle w:val="ListParagraph"/>
-        <w:numPr>
-          <w:ilvl w:val="0"/>
-          <w:numId w:val="19"/>
-        </w:numPr>
-        <w:spacing w:after="0"/>
-        <w:rPr>
-          <w:szCs w:val="20"/>
-        </w:rPr>
-      </w:pPr>
-      <w:r>
-        <w:rPr>
-          <w:szCs w:val="20"/>
-        </w:rPr>
-        <w:t>Can create another user (admin logged-in user)</w:t>
-      </w:r>
-    </w:p>
-    <w:p>
-      <w:pPr>
-        <w:pStyle w:val="ListParagraph"/>
-        <w:numPr>
-          <w:ilvl w:val="0"/>
-          <w:numId w:val="19"/>
-        </w:numPr>
-        <w:spacing w:after="0"/>
-        <w:rPr>
-          <w:szCs w:val="20"/>
-        </w:rPr>
-      </w:pPr>
-      <w:r>
-        <w:rPr>
-          <w:szCs w:val="20"/>
-        </w:rPr>
-        <w:t>Can’t create another user (non-admin logged-in user)</w:t>
-      </w:r>
-    </w:p>
-    <w:p>
-      <w:pPr>
-        <w:pStyle w:val="ListParagraph"/>
-        <w:numPr>
-          <w:ilvl w:val="0"/>
-          <w:numId w:val="19"/>
-        </w:numPr>
-        <w:spacing w:after="0"/>
-        <w:rPr>
-          <w:szCs w:val="20"/>
-        </w:rPr>
-      </w:pPr>
-      <w:r>
-        <w:rPr>
-          <w:szCs w:val="20"/>
-        </w:rPr>
-        <w:t>Can set the settings of every cabin (logged-in user)</w:t>
-      </w:r>
-    </w:p>
-    <w:p>
-      <w:pPr>
-        <w:pStyle w:val="ListParagraph"/>
-        <w:numPr>
-          <w:ilvl w:val="0"/>
-          <w:numId w:val="19"/>
-        </w:numPr>
-        <w:spacing w:after="0"/>
-        <w:rPr>
-          <w:szCs w:val="20"/>
-        </w:rPr>
-      </w:pPr>
-      <w:r>
-        <w:rPr>
-          <w:szCs w:val="20"/>
-        </w:rPr>
-        <w:t>Pagination ( Server and Client side )</w:t>
-      </w:r>
-    </w:p>
-    <w:p>
-      <w:pPr>
-        <w:spacing w:after="0"/>
-        <w:rPr>
-          <w:szCs w:val="20"/>
-        </w:rPr>
-      </w:pPr>
-    </w:p>
-    <w:p>
-      <w:pPr>
-        <w:spacing w:after="0"/>
-        <w:ind w:left="2880"/>
-        <w:rPr>
-          <w:b/>
-          <w:szCs w:val="20"/>
-        </w:rPr>
-      </w:pPr>
-      <w:r>
-        <w:rPr>
-          <w:b/>
-          <w:szCs w:val="20"/>
-        </w:rPr>
-        <w:t>Tech Stack</w:t>
-      </w:r>
-    </w:p>
-    <w:p>
-      <w:pPr>
-        <w:pStyle w:val="ListParagraph"/>
-        <w:numPr>
-          <w:ilvl w:val="0"/>
-          <w:numId w:val="14"/>
-        </w:numPr>
-        <w:spacing w:after="0"/>
-        <w:rPr>
-          <w:szCs w:val="20"/>
-        </w:rPr>
-      </w:pPr>
-      <w:r>
-        <w:rPr>
-          <w:szCs w:val="20"/>
-        </w:rPr>
         <w:t xml:space="preserve">React </w:t>
       </w:r>
       <w:proofErr w:type="spellStart"/>
@@ -8681,6 +8806,7 @@
         <w:rPr>
           <w:szCs w:val="20"/>
         </w:rPr>
+        <w:lastRenderedPageBreak/>
         <w:t>Customized Authorization</w:t>
       </w:r>
     </w:p>
@@ -8773,70 +8899,849 @@
         <w:rPr>
           <w:szCs w:val="20"/>
         </w:rPr>
+        <w:t>Native PHP</w:t>
+      </w:r>
+    </w:p>
+    <w:p>
+      <w:pPr>
+        <w:pStyle w:val="ListParagraph"/>
+        <w:numPr>
+          <w:ilvl w:val="0"/>
+          <w:numId w:val="14"/>
+        </w:numPr>
+        <w:spacing w:after="0"/>
+        <w:rPr>
+          <w:szCs w:val="20"/>
+        </w:rPr>
+      </w:pPr>
+      <w:proofErr w:type="spellStart"/>
+      <w:r>
+        <w:rPr>
+          <w:szCs w:val="20"/>
+        </w:rPr>
+        <w:t>Javascript</w:t>
+      </w:r>
+      <w:proofErr w:type="spellEnd"/>
+    </w:p>
+    <w:p>
+      <w:pPr>
+        <w:pStyle w:val="ListParagraph"/>
+        <w:numPr>
+          <w:ilvl w:val="0"/>
+          <w:numId w:val="14"/>
+        </w:numPr>
+        <w:spacing w:after="0"/>
+        <w:rPr>
+          <w:szCs w:val="20"/>
+        </w:rPr>
+      </w:pPr>
+      <w:r>
+        <w:rPr>
+          <w:szCs w:val="20"/>
+        </w:rPr>
+        <w:t>Tailwind CSS</w:t>
+      </w:r>
+    </w:p>
+    <w:p>
+      <w:pPr>
+        <w:pStyle w:val="ListParagraph"/>
+        <w:numPr>
+          <w:ilvl w:val="0"/>
+          <w:numId w:val="14"/>
+        </w:numPr>
+        <w:spacing w:after="0"/>
+        <w:rPr>
+          <w:szCs w:val="20"/>
+        </w:rPr>
+      </w:pPr>
+      <w:r>
+        <w:rPr>
+          <w:szCs w:val="20"/>
+        </w:rPr>
+        <w:t>SQLite</w:t>
+      </w:r>
+      <w:r>
+        <w:rPr>
+          <w:szCs w:val="20"/>
+        </w:rPr>
+        <w:tab/>
+      </w:r>
+    </w:p>
+    <w:p>
+      <w:pPr>
+        <w:spacing w:after="0"/>
+        <w:ind w:left="3240"/>
+        <w:rPr>
+          <w:szCs w:val="20"/>
+        </w:rPr>
+      </w:pPr>
+    </w:p>
+    <w:p>
+      <w:pPr>
+        <w:spacing w:after="0"/>
+        <w:ind w:left="3240"/>
+        <w:rPr>
+          <w:szCs w:val="20"/>
+        </w:rPr>
+      </w:pPr>
+    </w:p>
+    <w:p>
+      <w:pPr>
+        <w:spacing w:after="0"/>
+        <w:ind w:left="2880" w:hanging="2880"/>
+        <w:rPr>
+          <w:szCs w:val="20"/>
+        </w:rPr>
+      </w:pPr>
+      <w:proofErr w:type="spellStart"/>
+      <w:r>
+        <w:rPr>
+          <w:szCs w:val="20"/>
+        </w:rPr>
+        <w:t>EscapeEase</w:t>
+      </w:r>
+      <w:proofErr w:type="spellEnd"/>
+      <w:r>
+        <w:rPr>
+          <w:szCs w:val="20"/>
+        </w:rPr>
+        <w:tab/>
+      </w:r>
+      <w:r>
+        <w:t>A fully-featured travel agency website designed to provide users with a seamless experience in booking tours, managing their profiles, and interacting with the admin. The app includes dynamic content, secure user authentication, and a variety of functionalities such as payment processing, reviews, and messaging.</w:t>
+      </w:r>
+    </w:p>
+    <w:p>
+      <w:pPr>
+        <w:spacing w:after="0"/>
+        <w:rPr>
+          <w:szCs w:val="20"/>
+        </w:rPr>
+      </w:pPr>
+    </w:p>
+    <w:p>
+      <w:pPr>
+        <w:spacing w:after="0"/>
+        <w:ind w:left="2160" w:firstLine="720"/>
+        <w:rPr>
+          <w:b/>
+          <w:szCs w:val="20"/>
+        </w:rPr>
+      </w:pPr>
+      <w:r>
+        <w:rPr>
+          <w:b/>
+          <w:szCs w:val="20"/>
+        </w:rPr>
+        <w:t>Features</w:t>
+      </w:r>
+      <w:r>
+        <w:rPr>
+          <w:b/>
+          <w:szCs w:val="20"/>
+        </w:rPr>
+        <w:tab/>
+      </w:r>
+    </w:p>
+    <w:p>
+      <w:pPr>
+        <w:pStyle w:val="ListParagraph"/>
+        <w:numPr>
+          <w:ilvl w:val="0"/>
+          <w:numId w:val="19"/>
+        </w:numPr>
+        <w:spacing w:after="0"/>
+        <w:rPr>
+          <w:szCs w:val="20"/>
+        </w:rPr>
+      </w:pPr>
+      <w:r>
+        <w:rPr>
+          <w:szCs w:val="20"/>
+        </w:rPr>
+        <w:t>A lot of sections made for dynamic content</w:t>
+      </w:r>
+    </w:p>
+    <w:p>
+      <w:pPr>
+        <w:pStyle w:val="ListParagraph"/>
+        <w:numPr>
+          <w:ilvl w:val="0"/>
+          <w:numId w:val="19"/>
+        </w:numPr>
+        <w:spacing w:after="0"/>
+        <w:rPr>
+          <w:szCs w:val="20"/>
+        </w:rPr>
+      </w:pPr>
+      <w:r>
+        <w:rPr>
+          <w:szCs w:val="20"/>
+        </w:rPr>
+        <w:t xml:space="preserve">Login </w:t>
+      </w:r>
+    </w:p>
+    <w:p>
+      <w:pPr>
+        <w:pStyle w:val="ListParagraph"/>
+        <w:numPr>
+          <w:ilvl w:val="0"/>
+          <w:numId w:val="19"/>
+        </w:numPr>
+        <w:spacing w:after="0"/>
+        <w:rPr>
+          <w:szCs w:val="20"/>
+        </w:rPr>
+      </w:pPr>
+      <w:r>
+        <w:rPr>
+          <w:szCs w:val="20"/>
+        </w:rPr>
+        <w:t>Logout</w:t>
+      </w:r>
+    </w:p>
+    <w:p>
+      <w:pPr>
+        <w:pStyle w:val="ListParagraph"/>
+        <w:numPr>
+          <w:ilvl w:val="0"/>
+          <w:numId w:val="19"/>
+        </w:numPr>
+        <w:spacing w:after="0"/>
+        <w:rPr>
+          <w:szCs w:val="20"/>
+        </w:rPr>
+      </w:pPr>
+      <w:r>
+        <w:rPr>
+          <w:szCs w:val="20"/>
+        </w:rPr>
+        <w:t>Registration</w:t>
+      </w:r>
+    </w:p>
+    <w:p>
+      <w:pPr>
+        <w:pStyle w:val="ListParagraph"/>
+        <w:numPr>
+          <w:ilvl w:val="0"/>
+          <w:numId w:val="19"/>
+        </w:numPr>
+        <w:spacing w:after="0"/>
+        <w:rPr>
+          <w:szCs w:val="20"/>
+        </w:rPr>
+      </w:pPr>
+      <w:r>
+        <w:rPr>
+          <w:szCs w:val="20"/>
+        </w:rPr>
+        <w:t>Forget Password</w:t>
+      </w:r>
+    </w:p>
+    <w:p>
+      <w:pPr>
+        <w:pStyle w:val="ListParagraph"/>
+        <w:numPr>
+          <w:ilvl w:val="0"/>
+          <w:numId w:val="19"/>
+        </w:numPr>
+        <w:spacing w:after="0"/>
+        <w:rPr>
+          <w:szCs w:val="20"/>
+        </w:rPr>
+      </w:pPr>
+      <w:r>
+        <w:rPr>
+          <w:szCs w:val="20"/>
+        </w:rPr>
+        <w:t>Email Verification</w:t>
+      </w:r>
+    </w:p>
+    <w:p>
+      <w:pPr>
+        <w:pStyle w:val="ListParagraph"/>
+        <w:numPr>
+          <w:ilvl w:val="0"/>
+          <w:numId w:val="19"/>
+        </w:numPr>
+        <w:spacing w:after="0"/>
+        <w:rPr>
+          <w:szCs w:val="20"/>
+        </w:rPr>
+      </w:pPr>
+      <w:r>
+        <w:rPr>
+          <w:szCs w:val="20"/>
+        </w:rPr>
+        <w:t>Simple Dashboard of Authenticated User</w:t>
+      </w:r>
+    </w:p>
+    <w:p>
+      <w:pPr>
+        <w:pStyle w:val="ListParagraph"/>
+        <w:numPr>
+          <w:ilvl w:val="0"/>
+          <w:numId w:val="19"/>
+        </w:numPr>
+        <w:spacing w:after="0"/>
+        <w:rPr>
+          <w:szCs w:val="20"/>
+        </w:rPr>
+      </w:pPr>
+      <w:r>
+        <w:rPr>
+          <w:szCs w:val="20"/>
+        </w:rPr>
+        <w:t>User Can See the Bookings, Messages and Reviews</w:t>
+      </w:r>
+    </w:p>
+    <w:p>
+      <w:pPr>
+        <w:pStyle w:val="ListParagraph"/>
+        <w:numPr>
+          <w:ilvl w:val="0"/>
+          <w:numId w:val="19"/>
+        </w:numPr>
+        <w:spacing w:after="0"/>
+        <w:rPr>
+          <w:szCs w:val="20"/>
+        </w:rPr>
+      </w:pPr>
+      <w:r>
+        <w:rPr>
+          <w:szCs w:val="20"/>
+        </w:rPr>
+        <w:t>User Can Message the Admin</w:t>
+      </w:r>
+    </w:p>
+    <w:p>
+      <w:pPr>
+        <w:pStyle w:val="ListParagraph"/>
+        <w:numPr>
+          <w:ilvl w:val="0"/>
+          <w:numId w:val="19"/>
+        </w:numPr>
+        <w:spacing w:after="0"/>
+        <w:rPr>
+          <w:szCs w:val="20"/>
+        </w:rPr>
+      </w:pPr>
+      <w:r>
+        <w:rPr>
+          <w:szCs w:val="20"/>
+        </w:rPr>
+        <w:t xml:space="preserve">User Can Update </w:t>
+      </w:r>
+      <w:proofErr w:type="spellStart"/>
+      <w:r>
+        <w:rPr>
+          <w:szCs w:val="20"/>
+        </w:rPr>
+        <w:t>His/Her</w:t>
+      </w:r>
+      <w:proofErr w:type="spellEnd"/>
+      <w:r>
+        <w:rPr>
+          <w:szCs w:val="20"/>
+        </w:rPr>
+        <w:t xml:space="preserve"> Profile</w:t>
+      </w:r>
+    </w:p>
+    <w:p>
+      <w:pPr>
+        <w:pStyle w:val="ListParagraph"/>
+        <w:numPr>
+          <w:ilvl w:val="0"/>
+          <w:numId w:val="19"/>
+        </w:numPr>
+        <w:spacing w:after="0"/>
+        <w:rPr>
+          <w:szCs w:val="20"/>
+        </w:rPr>
+      </w:pPr>
+      <w:r>
+        <w:rPr>
+          <w:szCs w:val="20"/>
+        </w:rPr>
+        <w:t xml:space="preserve">User Can Change </w:t>
+      </w:r>
+      <w:proofErr w:type="spellStart"/>
+      <w:r>
+        <w:rPr>
+          <w:szCs w:val="20"/>
+        </w:rPr>
+        <w:t>His/Her</w:t>
+      </w:r>
+      <w:proofErr w:type="spellEnd"/>
+      <w:r>
+        <w:rPr>
+          <w:szCs w:val="20"/>
+        </w:rPr>
+        <w:t xml:space="preserve"> Password</w:t>
+      </w:r>
+    </w:p>
+    <w:p>
+      <w:pPr>
+        <w:pStyle w:val="ListParagraph"/>
+        <w:numPr>
+          <w:ilvl w:val="0"/>
+          <w:numId w:val="19"/>
+        </w:numPr>
+        <w:spacing w:after="0"/>
+        <w:rPr>
+          <w:szCs w:val="20"/>
+        </w:rPr>
+      </w:pPr>
+      <w:r>
+        <w:rPr>
+          <w:szCs w:val="20"/>
+        </w:rPr>
+        <w:t>User Can Make Rate and Review for Package</w:t>
+      </w:r>
+    </w:p>
+    <w:p>
+      <w:pPr>
+        <w:pStyle w:val="ListParagraph"/>
+        <w:numPr>
+          <w:ilvl w:val="0"/>
+          <w:numId w:val="19"/>
+        </w:numPr>
+        <w:spacing w:after="0"/>
+        <w:rPr>
+          <w:szCs w:val="20"/>
+        </w:rPr>
+      </w:pPr>
+      <w:r>
+        <w:rPr>
+          <w:szCs w:val="20"/>
+        </w:rPr>
+        <w:t>User Can Book for Tours</w:t>
+      </w:r>
+    </w:p>
+    <w:p>
+      <w:pPr>
+        <w:pStyle w:val="ListParagraph"/>
+        <w:numPr>
+          <w:ilvl w:val="0"/>
+          <w:numId w:val="19"/>
+        </w:numPr>
+        <w:spacing w:after="0"/>
+        <w:rPr>
+          <w:szCs w:val="20"/>
+        </w:rPr>
+      </w:pPr>
+      <w:r>
+        <w:rPr>
+          <w:szCs w:val="20"/>
+        </w:rPr>
+        <w:t>User Can Subscribe for Newsletter</w:t>
+      </w:r>
+    </w:p>
+    <w:p>
+      <w:pPr>
+        <w:pStyle w:val="ListParagraph"/>
+        <w:numPr>
+          <w:ilvl w:val="0"/>
+          <w:numId w:val="19"/>
+        </w:numPr>
+        <w:spacing w:after="0"/>
+        <w:rPr>
+          <w:szCs w:val="20"/>
+        </w:rPr>
+      </w:pPr>
+      <w:r>
+        <w:rPr>
+          <w:szCs w:val="20"/>
+        </w:rPr>
+        <w:t>Pagination</w:t>
+      </w:r>
+    </w:p>
+    <w:p>
+      <w:pPr>
+        <w:pStyle w:val="ListParagraph"/>
+        <w:numPr>
+          <w:ilvl w:val="0"/>
+          <w:numId w:val="19"/>
+        </w:numPr>
+        <w:spacing w:after="0"/>
+        <w:rPr>
+          <w:szCs w:val="20"/>
+        </w:rPr>
+      </w:pPr>
+      <w:r>
+        <w:rPr>
+          <w:szCs w:val="20"/>
+        </w:rPr>
+        <w:t>Filtering</w:t>
+      </w:r>
+    </w:p>
+    <w:p>
+      <w:pPr>
+        <w:pStyle w:val="ListParagraph"/>
+        <w:numPr>
+          <w:ilvl w:val="0"/>
+          <w:numId w:val="19"/>
+        </w:numPr>
+        <w:spacing w:after="0"/>
+        <w:rPr>
+          <w:szCs w:val="20"/>
+        </w:rPr>
+      </w:pPr>
+      <w:r>
+        <w:rPr>
+          <w:szCs w:val="20"/>
+        </w:rPr>
+        <w:t>Search Packages</w:t>
+      </w:r>
+    </w:p>
+    <w:p>
+      <w:pPr>
+        <w:pStyle w:val="ListParagraph"/>
+        <w:numPr>
+          <w:ilvl w:val="0"/>
+          <w:numId w:val="19"/>
+        </w:numPr>
+        <w:spacing w:after="0"/>
+        <w:rPr>
+          <w:szCs w:val="20"/>
+        </w:rPr>
+      </w:pPr>
+      <w:r>
+        <w:rPr>
+          <w:szCs w:val="20"/>
+        </w:rPr>
+        <w:t>Contact and Inquiry Functionality</w:t>
+      </w:r>
+    </w:p>
+    <w:p>
+      <w:pPr>
+        <w:pStyle w:val="ListParagraph"/>
+        <w:numPr>
+          <w:ilvl w:val="0"/>
+          <w:numId w:val="19"/>
+        </w:numPr>
+        <w:spacing w:after="0"/>
+        <w:rPr>
+          <w:szCs w:val="20"/>
+        </w:rPr>
+      </w:pPr>
+      <w:r>
+        <w:rPr>
+          <w:szCs w:val="20"/>
+        </w:rPr>
+        <w:t xml:space="preserve">Payment Methods Like </w:t>
+      </w:r>
+      <w:proofErr w:type="spellStart"/>
+      <w:r>
+        <w:rPr>
+          <w:szCs w:val="20"/>
+        </w:rPr>
+        <w:t>Paypal</w:t>
+      </w:r>
+      <w:proofErr w:type="spellEnd"/>
+      <w:r>
+        <w:rPr>
+          <w:szCs w:val="20"/>
+        </w:rPr>
+        <w:t>, Stripe and Cash Payment</w:t>
+      </w:r>
+    </w:p>
+    <w:p>
+      <w:pPr>
+        <w:pStyle w:val="ListParagraph"/>
+        <w:numPr>
+          <w:ilvl w:val="0"/>
+          <w:numId w:val="19"/>
+        </w:numPr>
+        <w:spacing w:after="0"/>
+        <w:rPr>
+          <w:szCs w:val="20"/>
+        </w:rPr>
+      </w:pPr>
+      <w:r>
+        <w:rPr>
+          <w:szCs w:val="20"/>
+        </w:rPr>
+        <w:t>Email Notification</w:t>
+      </w:r>
+    </w:p>
+    <w:p>
+      <w:pPr>
+        <w:pStyle w:val="ListParagraph"/>
+        <w:spacing w:after="0"/>
+        <w:ind w:left="3600"/>
+        <w:rPr>
+          <w:szCs w:val="20"/>
+        </w:rPr>
+      </w:pPr>
+    </w:p>
+    <w:p>
+      <w:pPr>
+        <w:pStyle w:val="ListParagraph"/>
+        <w:spacing w:after="0"/>
+        <w:ind w:left="3600"/>
+        <w:rPr>
+          <w:szCs w:val="20"/>
+        </w:rPr>
+      </w:pPr>
+    </w:p>
+    <w:p>
+      <w:pPr>
+        <w:spacing w:after="0"/>
+        <w:rPr>
+          <w:szCs w:val="20"/>
+        </w:rPr>
+      </w:pPr>
+    </w:p>
+    <w:p>
+      <w:pPr>
+        <w:spacing w:after="0"/>
+        <w:ind w:left="2880"/>
+        <w:rPr>
+          <w:b/>
+          <w:szCs w:val="20"/>
+        </w:rPr>
+      </w:pPr>
+      <w:r>
+        <w:rPr>
+          <w:b/>
+          <w:szCs w:val="20"/>
+        </w:rPr>
+        <w:t>Tech Stack</w:t>
+      </w:r>
+    </w:p>
+    <w:p>
+      <w:pPr>
+        <w:pStyle w:val="ListParagraph"/>
+        <w:numPr>
+          <w:ilvl w:val="0"/>
+          <w:numId w:val="14"/>
+        </w:numPr>
+        <w:spacing w:after="0"/>
+        <w:rPr>
+          <w:szCs w:val="20"/>
+        </w:rPr>
+      </w:pPr>
+      <w:r>
+        <w:rPr>
+          <w:szCs w:val="20"/>
+        </w:rPr>
+        <w:t>PHP</w:t>
+      </w:r>
+    </w:p>
+    <w:p>
+      <w:pPr>
+        <w:pStyle w:val="ListParagraph"/>
+        <w:numPr>
+          <w:ilvl w:val="0"/>
+          <w:numId w:val="14"/>
+        </w:numPr>
+        <w:spacing w:after="0"/>
+        <w:rPr>
+          <w:szCs w:val="20"/>
+        </w:rPr>
+      </w:pPr>
+      <w:proofErr w:type="spellStart"/>
+      <w:r>
+        <w:rPr>
+          <w:szCs w:val="20"/>
+        </w:rPr>
+        <w:t>Laravel</w:t>
+      </w:r>
+      <w:proofErr w:type="spellEnd"/>
+    </w:p>
+    <w:p>
+      <w:pPr>
+        <w:pStyle w:val="ListParagraph"/>
+        <w:numPr>
+          <w:ilvl w:val="0"/>
+          <w:numId w:val="14"/>
+        </w:numPr>
+        <w:spacing w:after="0"/>
+        <w:rPr>
+          <w:szCs w:val="20"/>
+        </w:rPr>
+      </w:pPr>
+      <w:proofErr w:type="spellStart"/>
+      <w:r>
+        <w:rPr>
+          <w:szCs w:val="20"/>
+        </w:rPr>
+        <w:t>Javascript</w:t>
+      </w:r>
+      <w:proofErr w:type="spellEnd"/>
+      <w:r>
+        <w:rPr>
+          <w:szCs w:val="20"/>
+        </w:rPr>
+        <w:t>/</w:t>
+      </w:r>
+      <w:proofErr w:type="spellStart"/>
+      <w:r>
+        <w:rPr>
+          <w:szCs w:val="20"/>
+        </w:rPr>
+        <w:t>Jquery</w:t>
+      </w:r>
+      <w:proofErr w:type="spellEnd"/>
+    </w:p>
+    <w:p>
+      <w:pPr>
+        <w:pStyle w:val="ListParagraph"/>
+        <w:numPr>
+          <w:ilvl w:val="0"/>
+          <w:numId w:val="14"/>
+        </w:numPr>
+        <w:spacing w:after="0"/>
+        <w:rPr>
+          <w:szCs w:val="20"/>
+        </w:rPr>
+      </w:pPr>
+      <w:r>
+        <w:rPr>
+          <w:szCs w:val="20"/>
+        </w:rPr>
+        <w:t>Bootstrap</w:t>
+      </w:r>
+    </w:p>
+    <w:p>
+      <w:pPr>
+        <w:pStyle w:val="ListParagraph"/>
+        <w:numPr>
+          <w:ilvl w:val="0"/>
+          <w:numId w:val="14"/>
+        </w:numPr>
+        <w:spacing w:after="0"/>
+        <w:rPr>
+          <w:szCs w:val="20"/>
+        </w:rPr>
+      </w:pPr>
+      <w:r>
+        <w:rPr>
+          <w:szCs w:val="20"/>
+        </w:rPr>
+        <w:t>MySQL</w:t>
+      </w:r>
+      <w:r>
+        <w:rPr>
+          <w:szCs w:val="20"/>
+        </w:rPr>
+        <w:tab/>
+      </w:r>
+      <w:r>
+        <w:rPr>
+          <w:szCs w:val="20"/>
+        </w:rPr>
+        <w:tab/>
+      </w:r>
+    </w:p>
+    <w:p>
+      <w:pPr>
+        <w:spacing w:after="0"/>
+        <w:rPr>
+          <w:szCs w:val="20"/>
+        </w:rPr>
+      </w:pPr>
+    </w:p>
+    <w:p>
+      <w:pPr>
+        <w:spacing w:after="0"/>
+        <w:rPr>
+          <w:szCs w:val="20"/>
+        </w:rPr>
+      </w:pPr>
+    </w:p>
+    <w:p>
+      <w:pPr>
+        <w:spacing w:after="0"/>
+        <w:ind w:left="2880" w:hanging="2880"/>
+        <w:rPr>
+          <w:szCs w:val="20"/>
+        </w:rPr>
+      </w:pPr>
+      <w:r>
+        <w:rPr>
+          <w:szCs w:val="20"/>
+        </w:rPr>
+        <w:t>Admin Panel (</w:t>
+      </w:r>
+      <w:proofErr w:type="spellStart"/>
+      <w:r>
+        <w:rPr>
+          <w:szCs w:val="20"/>
+        </w:rPr>
+        <w:t>EscapeEase</w:t>
+      </w:r>
+      <w:proofErr w:type="spellEnd"/>
+      <w:r>
+        <w:rPr>
+          <w:szCs w:val="20"/>
+        </w:rPr>
+        <w:t>)</w:t>
+      </w:r>
+      <w:r>
+        <w:rPr>
+          <w:szCs w:val="20"/>
+        </w:rPr>
+        <w:tab/>
+      </w:r>
+      <w:proofErr w:type="gramStart"/>
+      <w:r>
+        <w:t>A</w:t>
+      </w:r>
+      <w:proofErr w:type="gramEnd"/>
+      <w:r>
+        <w:t xml:space="preserve"> powerful and feature-rich admin panel designed for managing the content and operations of the </w:t>
+      </w:r>
+      <w:proofErr w:type="spellStart"/>
+      <w:r>
+        <w:rPr>
+          <w:rStyle w:val="Strong"/>
+        </w:rPr>
+        <w:t>EscapeEase</w:t>
+      </w:r>
+      <w:proofErr w:type="spellEnd"/>
+      <w:r>
+        <w:rPr>
+          <w:rStyle w:val="Strong"/>
+        </w:rPr>
+        <w:t xml:space="preserve"> Travel Agency Website</w:t>
+      </w:r>
+      <w:r>
+        <w:t xml:space="preserve">. The panel offers full control over various aspects of the website, including destinations, </w:t>
+      </w:r>
+      <w:r>
         <w:lastRenderedPageBreak/>
-        <w:t>Native PHP</w:t>
-      </w:r>
-    </w:p>
-    <w:p>
-      <w:pPr>
-        <w:pStyle w:val="ListParagraph"/>
-        <w:numPr>
-          <w:ilvl w:val="0"/>
-          <w:numId w:val="14"/>
-        </w:numPr>
-        <w:spacing w:after="0"/>
-        <w:rPr>
-          <w:szCs w:val="20"/>
-        </w:rPr>
-      </w:pPr>
-      <w:proofErr w:type="spellStart"/>
-      <w:r>
-        <w:rPr>
-          <w:szCs w:val="20"/>
-        </w:rPr>
-        <w:t>Javascript</w:t>
-      </w:r>
-      <w:proofErr w:type="spellEnd"/>
-    </w:p>
-    <w:p>
-      <w:pPr>
-        <w:pStyle w:val="ListParagraph"/>
-        <w:numPr>
-          <w:ilvl w:val="0"/>
-          <w:numId w:val="14"/>
-        </w:numPr>
-        <w:spacing w:after="0"/>
-        <w:rPr>
-          <w:szCs w:val="20"/>
-        </w:rPr>
-      </w:pPr>
-      <w:r>
-        <w:rPr>
-          <w:szCs w:val="20"/>
-        </w:rPr>
-        <w:t>Tailwind CSS</w:t>
-      </w:r>
-    </w:p>
-    <w:p>
-      <w:pPr>
-        <w:pStyle w:val="ListParagraph"/>
-        <w:numPr>
-          <w:ilvl w:val="0"/>
-          <w:numId w:val="14"/>
-        </w:numPr>
-        <w:spacing w:after="0"/>
-        <w:rPr>
-          <w:szCs w:val="20"/>
-        </w:rPr>
-      </w:pPr>
-      <w:r>
-        <w:rPr>
-          <w:szCs w:val="20"/>
-        </w:rPr>
-        <w:t>SQLite</w:t>
-      </w:r>
-      <w:r>
-        <w:rPr>
+        <w:t>tours, packages, blog posts, and more, with robust email and messaging capabilities.</w:t>
+      </w:r>
+    </w:p>
+    <w:p>
+      <w:pPr>
+        <w:spacing w:after="0"/>
+        <w:rPr>
+          <w:szCs w:val="20"/>
+        </w:rPr>
+      </w:pPr>
+    </w:p>
+    <w:p>
+      <w:pPr>
+        <w:spacing w:after="0"/>
+        <w:ind w:left="2160" w:firstLine="720"/>
+        <w:rPr>
+          <w:b/>
+          <w:szCs w:val="20"/>
+        </w:rPr>
+      </w:pPr>
+      <w:r>
+        <w:rPr>
+          <w:b/>
+          <w:szCs w:val="20"/>
+        </w:rPr>
+        <w:t>Features</w:t>
+      </w:r>
+      <w:r>
+        <w:rPr>
+          <w:b/>
           <w:szCs w:val="20"/>
         </w:rPr>
         <w:tab/>
@@ -8844,82 +9749,6 @@
     </w:p>
     <w:p>
       <w:pPr>
-        <w:spacing w:after="0"/>
-        <w:ind w:left="3240"/>
-        <w:rPr>
-          <w:szCs w:val="20"/>
-        </w:rPr>
-      </w:pPr>
-    </w:p>
-    <w:p>
-      <w:pPr>
-        <w:spacing w:after="0"/>
-        <w:ind w:left="3240"/>
-        <w:rPr>
-          <w:szCs w:val="20"/>
-        </w:rPr>
-      </w:pPr>
-    </w:p>
-    <w:p>
-      <w:pPr>
-        <w:spacing w:after="0"/>
-        <w:ind w:left="2880" w:hanging="2880"/>
-        <w:rPr>
-          <w:szCs w:val="20"/>
-        </w:rPr>
-      </w:pPr>
-      <w:proofErr w:type="spellStart"/>
-      <w:r>
-        <w:rPr>
-          <w:szCs w:val="20"/>
-        </w:rPr>
-        <w:t>EscapeEase</w:t>
-      </w:r>
-      <w:proofErr w:type="spellEnd"/>
-      <w:r>
-        <w:rPr>
-          <w:szCs w:val="20"/>
-        </w:rPr>
-        <w:tab/>
-      </w:r>
-      <w:r>
-        <w:t>A fully-featured travel agency website designed to provide users with a seamless experience in booking tours, managing their profiles, and interacting with the admin. The app includes dynamic content, secure user authentication, and a variety of functionalities such as payment processing, reviews, and messaging.</w:t>
-      </w:r>
-    </w:p>
-    <w:p>
-      <w:pPr>
-        <w:spacing w:after="0"/>
-        <w:rPr>
-          <w:szCs w:val="20"/>
-        </w:rPr>
-      </w:pPr>
-    </w:p>
-    <w:p>
-      <w:pPr>
-        <w:spacing w:after="0"/>
-        <w:ind w:left="2160" w:firstLine="720"/>
-        <w:rPr>
-          <w:b/>
-          <w:szCs w:val="20"/>
-        </w:rPr>
-      </w:pPr>
-      <w:r>
-        <w:rPr>
-          <w:b/>
-          <w:szCs w:val="20"/>
-        </w:rPr>
-        <w:t>Features</w:t>
-      </w:r>
-      <w:r>
-        <w:rPr>
-          <w:b/>
-          <w:szCs w:val="20"/>
-        </w:rPr>
-        <w:tab/>
-      </w:r>
-    </w:p>
-    <w:p>
-      <w:pPr>
         <w:pStyle w:val="ListParagraph"/>
         <w:numPr>
           <w:ilvl w:val="0"/>
@@ -8934,7 +9763,7 @@
         <w:rPr>
           <w:szCs w:val="20"/>
         </w:rPr>
-        <w:t>A lot of sections made for dynamic content</w:t>
+        <w:t>Login</w:t>
       </w:r>
     </w:p>
     <w:p>
@@ -8953,7 +9782,7 @@
         <w:rPr>
           <w:szCs w:val="20"/>
         </w:rPr>
-        <w:t xml:space="preserve">Login </w:t>
+        <w:t>Logout</w:t>
       </w:r>
     </w:p>
     <w:p>
@@ -8972,7 +9801,7 @@
         <w:rPr>
           <w:szCs w:val="20"/>
         </w:rPr>
-        <w:t>Logout</w:t>
+        <w:t>Admin can edit his/her profile</w:t>
       </w:r>
     </w:p>
     <w:p>
@@ -8991,707 +9820,6 @@
         <w:rPr>
           <w:szCs w:val="20"/>
         </w:rPr>
-        <w:t>Registration</w:t>
-      </w:r>
-    </w:p>
-    <w:p>
-      <w:pPr>
-        <w:pStyle w:val="ListParagraph"/>
-        <w:numPr>
-          <w:ilvl w:val="0"/>
-          <w:numId w:val="19"/>
-        </w:numPr>
-        <w:spacing w:after="0"/>
-        <w:rPr>
-          <w:szCs w:val="20"/>
-        </w:rPr>
-      </w:pPr>
-      <w:r>
-        <w:rPr>
-          <w:szCs w:val="20"/>
-        </w:rPr>
-        <w:t>Forget Password</w:t>
-      </w:r>
-    </w:p>
-    <w:p>
-      <w:pPr>
-        <w:pStyle w:val="ListParagraph"/>
-        <w:numPr>
-          <w:ilvl w:val="0"/>
-          <w:numId w:val="19"/>
-        </w:numPr>
-        <w:spacing w:after="0"/>
-        <w:rPr>
-          <w:szCs w:val="20"/>
-        </w:rPr>
-      </w:pPr>
-      <w:r>
-        <w:rPr>
-          <w:szCs w:val="20"/>
-        </w:rPr>
-        <w:t>Email Verification</w:t>
-      </w:r>
-    </w:p>
-    <w:p>
-      <w:pPr>
-        <w:pStyle w:val="ListParagraph"/>
-        <w:numPr>
-          <w:ilvl w:val="0"/>
-          <w:numId w:val="19"/>
-        </w:numPr>
-        <w:spacing w:after="0"/>
-        <w:rPr>
-          <w:szCs w:val="20"/>
-        </w:rPr>
-      </w:pPr>
-      <w:r>
-        <w:rPr>
-          <w:szCs w:val="20"/>
-        </w:rPr>
-        <w:t>Simple Dashboard of Authenticated User</w:t>
-      </w:r>
-    </w:p>
-    <w:p>
-      <w:pPr>
-        <w:pStyle w:val="ListParagraph"/>
-        <w:numPr>
-          <w:ilvl w:val="0"/>
-          <w:numId w:val="19"/>
-        </w:numPr>
-        <w:spacing w:after="0"/>
-        <w:rPr>
-          <w:szCs w:val="20"/>
-        </w:rPr>
-      </w:pPr>
-      <w:r>
-        <w:rPr>
-          <w:szCs w:val="20"/>
-        </w:rPr>
-        <w:t>User Can See the Bookings, Messages and Reviews</w:t>
-      </w:r>
-    </w:p>
-    <w:p>
-      <w:pPr>
-        <w:pStyle w:val="ListParagraph"/>
-        <w:numPr>
-          <w:ilvl w:val="0"/>
-          <w:numId w:val="19"/>
-        </w:numPr>
-        <w:spacing w:after="0"/>
-        <w:rPr>
-          <w:szCs w:val="20"/>
-        </w:rPr>
-      </w:pPr>
-      <w:r>
-        <w:rPr>
-          <w:szCs w:val="20"/>
-        </w:rPr>
-        <w:t>User Can Message the Admin</w:t>
-      </w:r>
-    </w:p>
-    <w:p>
-      <w:pPr>
-        <w:pStyle w:val="ListParagraph"/>
-        <w:numPr>
-          <w:ilvl w:val="0"/>
-          <w:numId w:val="19"/>
-        </w:numPr>
-        <w:spacing w:after="0"/>
-        <w:rPr>
-          <w:szCs w:val="20"/>
-        </w:rPr>
-      </w:pPr>
-      <w:r>
-        <w:rPr>
-          <w:szCs w:val="20"/>
-        </w:rPr>
-        <w:t xml:space="preserve">User Can Update </w:t>
-      </w:r>
-      <w:proofErr w:type="spellStart"/>
-      <w:r>
-        <w:rPr>
-          <w:szCs w:val="20"/>
-        </w:rPr>
-        <w:t>His/Her</w:t>
-      </w:r>
-      <w:proofErr w:type="spellEnd"/>
-      <w:r>
-        <w:rPr>
-          <w:szCs w:val="20"/>
-        </w:rPr>
-        <w:t xml:space="preserve"> Profile</w:t>
-      </w:r>
-    </w:p>
-    <w:p>
-      <w:pPr>
-        <w:pStyle w:val="ListParagraph"/>
-        <w:numPr>
-          <w:ilvl w:val="0"/>
-          <w:numId w:val="19"/>
-        </w:numPr>
-        <w:spacing w:after="0"/>
-        <w:rPr>
-          <w:szCs w:val="20"/>
-        </w:rPr>
-      </w:pPr>
-      <w:r>
-        <w:rPr>
-          <w:szCs w:val="20"/>
-        </w:rPr>
-        <w:t xml:space="preserve">User Can Change </w:t>
-      </w:r>
-      <w:proofErr w:type="spellStart"/>
-      <w:r>
-        <w:rPr>
-          <w:szCs w:val="20"/>
-        </w:rPr>
-        <w:t>His/Her</w:t>
-      </w:r>
-      <w:proofErr w:type="spellEnd"/>
-      <w:r>
-        <w:rPr>
-          <w:szCs w:val="20"/>
-        </w:rPr>
-        <w:t xml:space="preserve"> Password</w:t>
-      </w:r>
-    </w:p>
-    <w:p>
-      <w:pPr>
-        <w:pStyle w:val="ListParagraph"/>
-        <w:numPr>
-          <w:ilvl w:val="0"/>
-          <w:numId w:val="19"/>
-        </w:numPr>
-        <w:spacing w:after="0"/>
-        <w:rPr>
-          <w:szCs w:val="20"/>
-        </w:rPr>
-      </w:pPr>
-      <w:r>
-        <w:rPr>
-          <w:szCs w:val="20"/>
-        </w:rPr>
-        <w:t>User Can Make Rate and Review for Package</w:t>
-      </w:r>
-    </w:p>
-    <w:p>
-      <w:pPr>
-        <w:pStyle w:val="ListParagraph"/>
-        <w:numPr>
-          <w:ilvl w:val="0"/>
-          <w:numId w:val="19"/>
-        </w:numPr>
-        <w:spacing w:after="0"/>
-        <w:rPr>
-          <w:szCs w:val="20"/>
-        </w:rPr>
-      </w:pPr>
-      <w:r>
-        <w:rPr>
-          <w:szCs w:val="20"/>
-        </w:rPr>
-        <w:t>User Can Book for Tours</w:t>
-      </w:r>
-    </w:p>
-    <w:p>
-      <w:pPr>
-        <w:pStyle w:val="ListParagraph"/>
-        <w:numPr>
-          <w:ilvl w:val="0"/>
-          <w:numId w:val="19"/>
-        </w:numPr>
-        <w:spacing w:after="0"/>
-        <w:rPr>
-          <w:szCs w:val="20"/>
-        </w:rPr>
-      </w:pPr>
-      <w:r>
-        <w:rPr>
-          <w:szCs w:val="20"/>
-        </w:rPr>
-        <w:t>User Can Subscribe for Newsletter</w:t>
-      </w:r>
-    </w:p>
-    <w:p>
-      <w:pPr>
-        <w:pStyle w:val="ListParagraph"/>
-        <w:numPr>
-          <w:ilvl w:val="0"/>
-          <w:numId w:val="19"/>
-        </w:numPr>
-        <w:spacing w:after="0"/>
-        <w:rPr>
-          <w:szCs w:val="20"/>
-        </w:rPr>
-      </w:pPr>
-      <w:r>
-        <w:rPr>
-          <w:szCs w:val="20"/>
-        </w:rPr>
-        <w:t>Pagination</w:t>
-      </w:r>
-    </w:p>
-    <w:p>
-      <w:pPr>
-        <w:pStyle w:val="ListParagraph"/>
-        <w:numPr>
-          <w:ilvl w:val="0"/>
-          <w:numId w:val="19"/>
-        </w:numPr>
-        <w:spacing w:after="0"/>
-        <w:rPr>
-          <w:szCs w:val="20"/>
-        </w:rPr>
-      </w:pPr>
-      <w:r>
-        <w:rPr>
-          <w:szCs w:val="20"/>
-        </w:rPr>
-        <w:t>Filtering</w:t>
-      </w:r>
-    </w:p>
-    <w:p>
-      <w:pPr>
-        <w:pStyle w:val="ListParagraph"/>
-        <w:numPr>
-          <w:ilvl w:val="0"/>
-          <w:numId w:val="19"/>
-        </w:numPr>
-        <w:spacing w:after="0"/>
-        <w:rPr>
-          <w:szCs w:val="20"/>
-        </w:rPr>
-      </w:pPr>
-      <w:r>
-        <w:rPr>
-          <w:szCs w:val="20"/>
-        </w:rPr>
-        <w:t>Search Packages</w:t>
-      </w:r>
-    </w:p>
-    <w:p>
-      <w:pPr>
-        <w:pStyle w:val="ListParagraph"/>
-        <w:numPr>
-          <w:ilvl w:val="0"/>
-          <w:numId w:val="19"/>
-        </w:numPr>
-        <w:spacing w:after="0"/>
-        <w:rPr>
-          <w:szCs w:val="20"/>
-        </w:rPr>
-      </w:pPr>
-      <w:r>
-        <w:rPr>
-          <w:szCs w:val="20"/>
-        </w:rPr>
-        <w:t>Contact and Inquiry Functionality</w:t>
-      </w:r>
-    </w:p>
-    <w:p>
-      <w:pPr>
-        <w:pStyle w:val="ListParagraph"/>
-        <w:numPr>
-          <w:ilvl w:val="0"/>
-          <w:numId w:val="19"/>
-        </w:numPr>
-        <w:spacing w:after="0"/>
-        <w:rPr>
-          <w:szCs w:val="20"/>
-        </w:rPr>
-      </w:pPr>
-      <w:r>
-        <w:rPr>
-          <w:szCs w:val="20"/>
-        </w:rPr>
-        <w:t xml:space="preserve">Payment Methods Like </w:t>
-      </w:r>
-      <w:proofErr w:type="spellStart"/>
-      <w:r>
-        <w:rPr>
-          <w:szCs w:val="20"/>
-        </w:rPr>
-        <w:t>Paypal</w:t>
-      </w:r>
-      <w:proofErr w:type="spellEnd"/>
-      <w:r>
-        <w:rPr>
-          <w:szCs w:val="20"/>
-        </w:rPr>
-        <w:t>, Stripe and Cash Payment</w:t>
-      </w:r>
-    </w:p>
-    <w:p>
-      <w:pPr>
-        <w:pStyle w:val="ListParagraph"/>
-        <w:numPr>
-          <w:ilvl w:val="0"/>
-          <w:numId w:val="19"/>
-        </w:numPr>
-        <w:spacing w:after="0"/>
-        <w:rPr>
-          <w:szCs w:val="20"/>
-        </w:rPr>
-      </w:pPr>
-      <w:r>
-        <w:rPr>
-          <w:szCs w:val="20"/>
-        </w:rPr>
-        <w:t>Email Notification</w:t>
-      </w:r>
-    </w:p>
-    <w:p>
-      <w:pPr>
-        <w:pStyle w:val="ListParagraph"/>
-        <w:spacing w:after="0"/>
-        <w:ind w:left="3600"/>
-        <w:rPr>
-          <w:szCs w:val="20"/>
-        </w:rPr>
-      </w:pPr>
-    </w:p>
-    <w:p>
-      <w:pPr>
-        <w:pStyle w:val="ListParagraph"/>
-        <w:spacing w:after="0"/>
-        <w:ind w:left="3600"/>
-        <w:rPr>
-          <w:szCs w:val="20"/>
-        </w:rPr>
-      </w:pPr>
-    </w:p>
-    <w:p>
-      <w:pPr>
-        <w:spacing w:after="0"/>
-        <w:rPr>
-          <w:szCs w:val="20"/>
-        </w:rPr>
-      </w:pPr>
-    </w:p>
-    <w:p>
-      <w:pPr>
-        <w:spacing w:after="0"/>
-        <w:ind w:left="2880"/>
-        <w:rPr>
-          <w:b/>
-          <w:szCs w:val="20"/>
-        </w:rPr>
-      </w:pPr>
-      <w:r>
-        <w:rPr>
-          <w:b/>
-          <w:szCs w:val="20"/>
-        </w:rPr>
-        <w:t>Tech Stack</w:t>
-      </w:r>
-    </w:p>
-    <w:p>
-      <w:pPr>
-        <w:pStyle w:val="ListParagraph"/>
-        <w:numPr>
-          <w:ilvl w:val="0"/>
-          <w:numId w:val="14"/>
-        </w:numPr>
-        <w:spacing w:after="0"/>
-        <w:rPr>
-          <w:szCs w:val="20"/>
-        </w:rPr>
-      </w:pPr>
-      <w:r>
-        <w:rPr>
-          <w:szCs w:val="20"/>
-        </w:rPr>
-        <w:t>PHP</w:t>
-      </w:r>
-    </w:p>
-    <w:p>
-      <w:pPr>
-        <w:pStyle w:val="ListParagraph"/>
-        <w:numPr>
-          <w:ilvl w:val="0"/>
-          <w:numId w:val="14"/>
-        </w:numPr>
-        <w:spacing w:after="0"/>
-        <w:rPr>
-          <w:szCs w:val="20"/>
-        </w:rPr>
-      </w:pPr>
-      <w:proofErr w:type="spellStart"/>
-      <w:r>
-        <w:rPr>
-          <w:szCs w:val="20"/>
-        </w:rPr>
-        <w:t>Laravel</w:t>
-      </w:r>
-      <w:proofErr w:type="spellEnd"/>
-    </w:p>
-    <w:p>
-      <w:pPr>
-        <w:pStyle w:val="ListParagraph"/>
-        <w:numPr>
-          <w:ilvl w:val="0"/>
-          <w:numId w:val="14"/>
-        </w:numPr>
-        <w:spacing w:after="0"/>
-        <w:rPr>
-          <w:szCs w:val="20"/>
-        </w:rPr>
-      </w:pPr>
-      <w:proofErr w:type="spellStart"/>
-      <w:r>
-        <w:rPr>
-          <w:szCs w:val="20"/>
-        </w:rPr>
-        <w:t>Javascript</w:t>
-      </w:r>
-      <w:proofErr w:type="spellEnd"/>
-      <w:r>
-        <w:rPr>
-          <w:szCs w:val="20"/>
-        </w:rPr>
-        <w:t>/</w:t>
-      </w:r>
-      <w:proofErr w:type="spellStart"/>
-      <w:r>
-        <w:rPr>
-          <w:szCs w:val="20"/>
-        </w:rPr>
-        <w:t>Jquery</w:t>
-      </w:r>
-      <w:proofErr w:type="spellEnd"/>
-    </w:p>
-    <w:p>
-      <w:pPr>
-        <w:pStyle w:val="ListParagraph"/>
-        <w:numPr>
-          <w:ilvl w:val="0"/>
-          <w:numId w:val="14"/>
-        </w:numPr>
-        <w:spacing w:after="0"/>
-        <w:rPr>
-          <w:szCs w:val="20"/>
-        </w:rPr>
-      </w:pPr>
-      <w:r>
-        <w:rPr>
-          <w:szCs w:val="20"/>
-        </w:rPr>
-        <w:t>Bootstrap</w:t>
-      </w:r>
-    </w:p>
-    <w:p>
-      <w:pPr>
-        <w:pStyle w:val="ListParagraph"/>
-        <w:numPr>
-          <w:ilvl w:val="0"/>
-          <w:numId w:val="14"/>
-        </w:numPr>
-        <w:spacing w:after="0"/>
-        <w:rPr>
-          <w:szCs w:val="20"/>
-        </w:rPr>
-      </w:pPr>
-      <w:r>
-        <w:rPr>
-          <w:szCs w:val="20"/>
-        </w:rPr>
-        <w:t>MySQL</w:t>
-      </w:r>
-      <w:r>
-        <w:rPr>
-          <w:szCs w:val="20"/>
-        </w:rPr>
-        <w:tab/>
-      </w:r>
-      <w:r>
-        <w:rPr>
-          <w:szCs w:val="20"/>
-        </w:rPr>
-        <w:tab/>
-      </w:r>
-    </w:p>
-    <w:p>
-      <w:pPr>
-        <w:spacing w:after="0"/>
-        <w:rPr>
-          <w:szCs w:val="20"/>
-        </w:rPr>
-      </w:pPr>
-    </w:p>
-    <w:p>
-      <w:pPr>
-        <w:spacing w:after="0"/>
-        <w:rPr>
-          <w:szCs w:val="20"/>
-        </w:rPr>
-      </w:pPr>
-    </w:p>
-    <w:p>
-      <w:pPr>
-        <w:spacing w:after="0"/>
-        <w:ind w:left="2880" w:hanging="2880"/>
-        <w:rPr>
-          <w:szCs w:val="20"/>
-        </w:rPr>
-      </w:pPr>
-      <w:r>
-        <w:rPr>
-          <w:szCs w:val="20"/>
-        </w:rPr>
-        <w:t>Admin Panel (</w:t>
-      </w:r>
-      <w:proofErr w:type="spellStart"/>
-      <w:r>
-        <w:rPr>
-          <w:szCs w:val="20"/>
-        </w:rPr>
-        <w:t>EscapeEase</w:t>
-      </w:r>
-      <w:proofErr w:type="spellEnd"/>
-      <w:r>
-        <w:rPr>
-          <w:szCs w:val="20"/>
-        </w:rPr>
-        <w:t>)</w:t>
-      </w:r>
-      <w:r>
-        <w:rPr>
-          <w:szCs w:val="20"/>
-        </w:rPr>
-        <w:tab/>
-      </w:r>
-      <w:proofErr w:type="gramStart"/>
-      <w:r>
-        <w:t>A</w:t>
-      </w:r>
-      <w:proofErr w:type="gramEnd"/>
-      <w:r>
-        <w:t xml:space="preserve"> powerful and feature-rich admin panel designed for managing the content and operations of the </w:t>
-      </w:r>
-      <w:proofErr w:type="spellStart"/>
-      <w:r>
-        <w:rPr>
-          <w:rStyle w:val="Strong"/>
-        </w:rPr>
-        <w:t>EscapeEase</w:t>
-      </w:r>
-      <w:proofErr w:type="spellEnd"/>
-      <w:r>
-        <w:rPr>
-          <w:rStyle w:val="Strong"/>
-        </w:rPr>
-        <w:t xml:space="preserve"> Travel Agency Website</w:t>
-      </w:r>
-      <w:r>
-        <w:t>. The panel offers full control over various aspects of the website, including destinations, tours, packages, blog posts, and more, with robust email and messaging capabilities.</w:t>
-      </w:r>
-    </w:p>
-    <w:p>
-      <w:pPr>
-        <w:spacing w:after="0"/>
-        <w:rPr>
-          <w:szCs w:val="20"/>
-        </w:rPr>
-      </w:pPr>
-    </w:p>
-    <w:p>
-      <w:pPr>
-        <w:spacing w:after="0"/>
-        <w:ind w:left="2160" w:firstLine="720"/>
-        <w:rPr>
-          <w:b/>
-          <w:szCs w:val="20"/>
-        </w:rPr>
-      </w:pPr>
-      <w:r>
-        <w:rPr>
-          <w:b/>
-          <w:szCs w:val="20"/>
-        </w:rPr>
-        <w:t>Features</w:t>
-      </w:r>
-      <w:r>
-        <w:rPr>
-          <w:b/>
-          <w:szCs w:val="20"/>
-        </w:rPr>
-        <w:tab/>
-      </w:r>
-    </w:p>
-    <w:p>
-      <w:pPr>
-        <w:pStyle w:val="ListParagraph"/>
-        <w:numPr>
-          <w:ilvl w:val="0"/>
-          <w:numId w:val="19"/>
-        </w:numPr>
-        <w:spacing w:after="0"/>
-        <w:rPr>
-          <w:szCs w:val="20"/>
-        </w:rPr>
-      </w:pPr>
-      <w:r>
-        <w:rPr>
-          <w:szCs w:val="20"/>
-        </w:rPr>
-        <w:t>Login</w:t>
-      </w:r>
-    </w:p>
-    <w:p>
-      <w:pPr>
-        <w:pStyle w:val="ListParagraph"/>
-        <w:numPr>
-          <w:ilvl w:val="0"/>
-          <w:numId w:val="19"/>
-        </w:numPr>
-        <w:spacing w:after="0"/>
-        <w:rPr>
-          <w:szCs w:val="20"/>
-        </w:rPr>
-      </w:pPr>
-      <w:r>
-        <w:rPr>
-          <w:szCs w:val="20"/>
-        </w:rPr>
-        <w:t>Logout</w:t>
-      </w:r>
-    </w:p>
-    <w:p>
-      <w:pPr>
-        <w:pStyle w:val="ListParagraph"/>
-        <w:numPr>
-          <w:ilvl w:val="0"/>
-          <w:numId w:val="19"/>
-        </w:numPr>
-        <w:spacing w:after="0"/>
-        <w:rPr>
-          <w:szCs w:val="20"/>
-        </w:rPr>
-      </w:pPr>
-      <w:r>
-        <w:rPr>
-          <w:szCs w:val="20"/>
-        </w:rPr>
-        <w:t>Admin can edit his/her profile</w:t>
-      </w:r>
-    </w:p>
-    <w:p>
-      <w:pPr>
-        <w:pStyle w:val="ListParagraph"/>
-        <w:numPr>
-          <w:ilvl w:val="0"/>
-          <w:numId w:val="19"/>
-        </w:numPr>
-        <w:spacing w:after="0"/>
-        <w:rPr>
-          <w:szCs w:val="20"/>
-        </w:rPr>
-      </w:pPr>
-      <w:r>
-        <w:rPr>
-          <w:szCs w:val="20"/>
-        </w:rPr>
-        <w:lastRenderedPageBreak/>
         <w:t>Dashboard for s</w:t>
       </w:r>
       <w:r>
@@ -10574,6 +10702,7 @@
           <w:b/>
           <w:szCs w:val="20"/>
         </w:rPr>
+        <w:lastRenderedPageBreak/>
         <w:t xml:space="preserve">CCNA Routing and Switching Essentials </w:t>
       </w:r>
       <w:r>
@@ -10693,8 +10822,6 @@
         </w:rPr>
         <w:t>AI for CX and Tech</w:t>
       </w:r>
-      <w:bookmarkStart w:id="0" w:name="_GoBack"/>
-      <w:bookmarkEnd w:id="0"/>
     </w:p>
     <w:sectPr>
       <w:pgSz w:w="12240" w:h="15840"/>

</xml_diff>